<commit_message>
docs(module05): user guide rev.3 — Helmet 01–10 RTSP, 4-panel feature list
- 10 patrol helmets (HC-01..HC-10), RTSP streams
- Features grouped: Tổng quan, Camera, Heatmap, Sự kiện
- Codes TQ/CAM/MAP/EVT; flycam/flymap still deferred

Co-authored-by: Duncan <Duncan882022@users.noreply.github.com>
</commit_message>
<xml_diff>
--- a/docs/module05/Module05_HuongDanSuDung.docx
+++ b/docs/module05/Module05_HuongDanSuDung.docx
@@ -51,7 +51,7 @@
           <w:color w:val="666666"/>
           <w:sz w:val="18"/>
         </w:rPr>
-        <w:t>Đường dẫn: /module05   |   Phiên bản: 2026-09-16 · rev.2</w:t>
+        <w:t>Đường dẫn: /module05   |   Phiên bản: 2026-09-16 · rev.3</w:t>
       </w:r>
     </w:p>
     <w:p/>
@@ -77,6 +77,7 @@
                 <w:rFonts w:ascii="Calibri" w:hAnsi="Calibri" w:eastAsia="Calibri"/>
                 <w:b/>
                 <w:i w:val="0"/>
+                <w:color w:val="FFFFFF"/>
                 <w:sz w:val="20"/>
               </w:rPr>
               <w:t>Trường</w:t>
@@ -94,6 +95,7 @@
                 <w:rFonts w:ascii="Calibri" w:hAnsi="Calibri" w:eastAsia="Calibri"/>
                 <w:b/>
                 <w:i w:val="0"/>
+                <w:color w:val="FFFFFF"/>
                 <w:sz w:val="20"/>
               </w:rPr>
               <w:t>Giá trị</w:t>
@@ -148,7 +150,7 @@
                 <w:i w:val="0"/>
                 <w:sz w:val="20"/>
               </w:rPr>
-              <w:t>Phạm vi</w:t>
+              <w:t>Thiết bị</w:t>
             </w:r>
           </w:p>
         </w:tc>
@@ -164,7 +166,7 @@
                 <w:i w:val="0"/>
                 <w:sz w:val="20"/>
               </w:rPr>
-              <w:t>Màn hình chính /module05 — Tổng quan, Camera, Heatmap, Sự kiện</w:t>
+              <w:t>Helmet 01 – Helmet 10 (10 mũ, luồng RTSP)</w:t>
             </w:r>
           </w:p>
         </w:tc>
@@ -182,7 +184,7 @@
                 <w:i w:val="0"/>
                 <w:sz w:val="20"/>
               </w:rPr>
-              <w:t>Ngoài phạm vi (tạm thời)</w:t>
+              <w:t>Cấu trúc tài liệu</w:t>
             </w:r>
           </w:p>
         </w:tc>
@@ -198,7 +200,7 @@
                 <w:i w:val="0"/>
                 <w:sz w:val="20"/>
               </w:rPr>
-              <w:t>Flycam / Flymap · Trang bổ trợ — xem mục cuối tài liệu</w:t>
+              <w:t>Tổng quan → Camera → Heatmap → Sự kiện</w:t>
             </w:r>
           </w:p>
         </w:tc>
@@ -226,7 +228,7 @@
           <w:i w:val="0"/>
           <w:sz w:val="20"/>
         </w:rPr>
-        <w:t>1. Thuật ngữ &amp; quy ước</w:t>
+        <w:t>1. Thuật ngữ &amp; thiết bị tuần tra</w:t>
       </w:r>
     </w:p>
     <w:p>
@@ -237,7 +239,7 @@
           <w:i w:val="0"/>
           <w:sz w:val="20"/>
         </w:rPr>
-        <w:t>2. Danh sách tính năng (theo bố cục màn hình — trên xuống dưới)</w:t>
+        <w:t>2. Danh sách tính năng</w:t>
       </w:r>
     </w:p>
     <w:p>
@@ -248,7 +250,7 @@
           <w:i w:val="0"/>
           <w:sz w:val="20"/>
         </w:rPr>
-        <w:t xml:space="preserve">   2.1  Tiêu đề trang</w:t>
+        <w:t xml:space="preserve">   2.1  Tổng quan</w:t>
       </w:r>
     </w:p>
     <w:p>
@@ -259,7 +261,7 @@
           <w:i w:val="0"/>
           <w:sz w:val="20"/>
         </w:rPr>
-        <w:t xml:space="preserve">   2.2  Panel Tổng Quan</w:t>
+        <w:t xml:space="preserve">   2.2  Camera</w:t>
       </w:r>
     </w:p>
     <w:p>
@@ -270,7 +272,7 @@
           <w:i w:val="0"/>
           <w:sz w:val="20"/>
         </w:rPr>
-        <w:t xml:space="preserve">   2.3  Panel Camera</w:t>
+        <w:t xml:space="preserve">   2.3  Heatmap</w:t>
       </w:r>
     </w:p>
     <w:p>
@@ -281,18 +283,7 @@
           <w:i w:val="0"/>
           <w:sz w:val="20"/>
         </w:rPr>
-        <w:t xml:space="preserve">   2.4  Panel Heatmap</w:t>
-      </w:r>
-    </w:p>
-    <w:p>
-      <w:r>
-        <w:rPr>
-          <w:rFonts w:ascii="Calibri" w:hAnsi="Calibri" w:eastAsia="Calibri"/>
-          <w:b w:val="0"/>
-          <w:i w:val="0"/>
-          <w:sz w:val="20"/>
-        </w:rPr>
-        <w:t xml:space="preserve">   2.5  Panel Sự kiện</w:t>
+        <w:t xml:space="preserve">   2.4  Sự kiện</w:t>
       </w:r>
     </w:p>
     <w:p>
@@ -325,7 +316,7 @@
           <w:i w:val="0"/>
           <w:sz w:val="20"/>
         </w:rPr>
-        <w:t>5. Phụ lục — mục tạm hoãn (Flycam/Flymap · Trang bổ trợ)</w:t>
+        <w:t>5. Phụ lục — mục tạm hoãn</w:t>
       </w:r>
     </w:p>
     <w:p>
@@ -338,7 +329,7 @@
         <w:pStyle w:val="Heading1"/>
       </w:pPr>
       <w:r>
-        <w:t>1. Thuật ngữ &amp; quy ước</w:t>
+        <w:t>1. Thuật ngữ &amp; thiết bị tuần tra</w:t>
       </w:r>
     </w:p>
     <w:p>
@@ -346,7 +337,18 @@
         <w:pStyle w:val="Heading2"/>
       </w:pPr>
       <w:r>
-        <w:t>1.1  Thiết bị tuần tra (helmet)</w:t>
+        <w:t>1.1  Thiết bị Helmet 01 – Helmet 10</w:t>
+      </w:r>
+    </w:p>
+    <w:p>
+      <w:r>
+        <w:rPr>
+          <w:rFonts w:ascii="Calibri" w:hAnsi="Calibri" w:eastAsia="Calibri"/>
+          <w:b w:val="0"/>
+          <w:i w:val="0"/>
+          <w:sz w:val="22"/>
+        </w:rPr>
+        <w:t>Hệ thống giám sát 10 mũ bodycam, mỗi mũ phát một luồng RTSP riêng qua MediaMTX.</w:t>
       </w:r>
     </w:p>
     <w:tbl>
@@ -364,7 +366,7 @@
         <w:tc>
           <w:tcPr>
             <w:tcW w:type="dxa" w:w="3135"/>
-            <w:shd w:fill="1F3864" w:val="clear"/>
+            <w:shd w:fill="2E5090" w:val="clear"/>
           </w:tcPr>
           <w:p>
             <w:r>
@@ -382,7 +384,7 @@
         <w:tc>
           <w:tcPr>
             <w:tcW w:type="dxa" w:w="3135"/>
-            <w:shd w:fill="1F3864" w:val="clear"/>
+            <w:shd w:fill="2E5090" w:val="clear"/>
           </w:tcPr>
           <w:p>
             <w:r>
@@ -400,7 +402,7 @@
         <w:tc>
           <w:tcPr>
             <w:tcW w:type="dxa" w:w="3135"/>
-            <w:shd w:fill="1F3864" w:val="clear"/>
+            <w:shd w:fill="2E5090" w:val="clear"/>
           </w:tcPr>
           <w:p>
             <w:r>
@@ -411,7 +413,7 @@
                 <w:color w:val="FFFFFF"/>
                 <w:sz w:val="20"/>
               </w:rPr>
-              <w:t>Vai trò</w:t>
+              <w:t>Luồng / Vai trò</w:t>
             </w:r>
           </w:p>
         </w:tc>
@@ -461,7 +463,7 @@
                 <w:i w:val="0"/>
                 <w:sz w:val="20"/>
               </w:rPr>
-              <w:t>Mũ bodycam tuần tra — luồng RTSP</w:t>
+              <w:t>Luồng RTSP — bodycam tuần tra khu vực</w:t>
             </w:r>
           </w:p>
         </w:tc>
@@ -511,7 +513,407 @@
                 <w:i w:val="0"/>
                 <w:sz w:val="20"/>
               </w:rPr>
-              <w:t>Mũ bodycam di động — GPS &amp; luồng WHIP</w:t>
+              <w:t>Luồng RTSP — bodycam tuần tra khu vực</w:t>
+            </w:r>
+          </w:p>
+        </w:tc>
+      </w:tr>
+      <w:tr>
+        <w:tc>
+          <w:tcPr>
+            <w:tcW w:type="dxa" w:w="3135"/>
+          </w:tcPr>
+          <w:p>
+            <w:r>
+              <w:rPr>
+                <w:rFonts w:ascii="Calibri" w:hAnsi="Calibri" w:eastAsia="Calibri"/>
+                <w:b w:val="0"/>
+                <w:i w:val="0"/>
+                <w:sz w:val="20"/>
+              </w:rPr>
+              <w:t>Helmet 03</w:t>
+            </w:r>
+          </w:p>
+        </w:tc>
+        <w:tc>
+          <w:tcPr>
+            <w:tcW w:type="dxa" w:w="3135"/>
+          </w:tcPr>
+          <w:p>
+            <w:r>
+              <w:rPr>
+                <w:rFonts w:ascii="Calibri" w:hAnsi="Calibri" w:eastAsia="Calibri"/>
+                <w:b w:val="0"/>
+                <w:i w:val="0"/>
+                <w:sz w:val="20"/>
+              </w:rPr>
+              <w:t>HC-03</w:t>
+            </w:r>
+          </w:p>
+        </w:tc>
+        <w:tc>
+          <w:tcPr>
+            <w:tcW w:type="dxa" w:w="3135"/>
+          </w:tcPr>
+          <w:p>
+            <w:r>
+              <w:rPr>
+                <w:rFonts w:ascii="Calibri" w:hAnsi="Calibri" w:eastAsia="Calibri"/>
+                <w:b w:val="0"/>
+                <w:i w:val="0"/>
+                <w:sz w:val="20"/>
+              </w:rPr>
+              <w:t>Luồng RTSP — bodycam tuần tra khu vực</w:t>
+            </w:r>
+          </w:p>
+        </w:tc>
+      </w:tr>
+      <w:tr>
+        <w:tc>
+          <w:tcPr>
+            <w:tcW w:type="dxa" w:w="3135"/>
+          </w:tcPr>
+          <w:p>
+            <w:r>
+              <w:rPr>
+                <w:rFonts w:ascii="Calibri" w:hAnsi="Calibri" w:eastAsia="Calibri"/>
+                <w:b w:val="0"/>
+                <w:i w:val="0"/>
+                <w:sz w:val="20"/>
+              </w:rPr>
+              <w:t>Helmet 04</w:t>
+            </w:r>
+          </w:p>
+        </w:tc>
+        <w:tc>
+          <w:tcPr>
+            <w:tcW w:type="dxa" w:w="3135"/>
+          </w:tcPr>
+          <w:p>
+            <w:r>
+              <w:rPr>
+                <w:rFonts w:ascii="Calibri" w:hAnsi="Calibri" w:eastAsia="Calibri"/>
+                <w:b w:val="0"/>
+                <w:i w:val="0"/>
+                <w:sz w:val="20"/>
+              </w:rPr>
+              <w:t>HC-04</w:t>
+            </w:r>
+          </w:p>
+        </w:tc>
+        <w:tc>
+          <w:tcPr>
+            <w:tcW w:type="dxa" w:w="3135"/>
+          </w:tcPr>
+          <w:p>
+            <w:r>
+              <w:rPr>
+                <w:rFonts w:ascii="Calibri" w:hAnsi="Calibri" w:eastAsia="Calibri"/>
+                <w:b w:val="0"/>
+                <w:i w:val="0"/>
+                <w:sz w:val="20"/>
+              </w:rPr>
+              <w:t>Luồng RTSP — bodycam tuần tra khu vực</w:t>
+            </w:r>
+          </w:p>
+        </w:tc>
+      </w:tr>
+      <w:tr>
+        <w:tc>
+          <w:tcPr>
+            <w:tcW w:type="dxa" w:w="3135"/>
+          </w:tcPr>
+          <w:p>
+            <w:r>
+              <w:rPr>
+                <w:rFonts w:ascii="Calibri" w:hAnsi="Calibri" w:eastAsia="Calibri"/>
+                <w:b w:val="0"/>
+                <w:i w:val="0"/>
+                <w:sz w:val="20"/>
+              </w:rPr>
+              <w:t>Helmet 05</w:t>
+            </w:r>
+          </w:p>
+        </w:tc>
+        <w:tc>
+          <w:tcPr>
+            <w:tcW w:type="dxa" w:w="3135"/>
+          </w:tcPr>
+          <w:p>
+            <w:r>
+              <w:rPr>
+                <w:rFonts w:ascii="Calibri" w:hAnsi="Calibri" w:eastAsia="Calibri"/>
+                <w:b w:val="0"/>
+                <w:i w:val="0"/>
+                <w:sz w:val="20"/>
+              </w:rPr>
+              <w:t>HC-05</w:t>
+            </w:r>
+          </w:p>
+        </w:tc>
+        <w:tc>
+          <w:tcPr>
+            <w:tcW w:type="dxa" w:w="3135"/>
+          </w:tcPr>
+          <w:p>
+            <w:r>
+              <w:rPr>
+                <w:rFonts w:ascii="Calibri" w:hAnsi="Calibri" w:eastAsia="Calibri"/>
+                <w:b w:val="0"/>
+                <w:i w:val="0"/>
+                <w:sz w:val="20"/>
+              </w:rPr>
+              <w:t>Luồng RTSP — bodycam tuần tra khu vực</w:t>
+            </w:r>
+          </w:p>
+        </w:tc>
+      </w:tr>
+      <w:tr>
+        <w:tc>
+          <w:tcPr>
+            <w:tcW w:type="dxa" w:w="3135"/>
+          </w:tcPr>
+          <w:p>
+            <w:r>
+              <w:rPr>
+                <w:rFonts w:ascii="Calibri" w:hAnsi="Calibri" w:eastAsia="Calibri"/>
+                <w:b w:val="0"/>
+                <w:i w:val="0"/>
+                <w:sz w:val="20"/>
+              </w:rPr>
+              <w:t>Helmet 06</w:t>
+            </w:r>
+          </w:p>
+        </w:tc>
+        <w:tc>
+          <w:tcPr>
+            <w:tcW w:type="dxa" w:w="3135"/>
+          </w:tcPr>
+          <w:p>
+            <w:r>
+              <w:rPr>
+                <w:rFonts w:ascii="Calibri" w:hAnsi="Calibri" w:eastAsia="Calibri"/>
+                <w:b w:val="0"/>
+                <w:i w:val="0"/>
+                <w:sz w:val="20"/>
+              </w:rPr>
+              <w:t>HC-06</w:t>
+            </w:r>
+          </w:p>
+        </w:tc>
+        <w:tc>
+          <w:tcPr>
+            <w:tcW w:type="dxa" w:w="3135"/>
+          </w:tcPr>
+          <w:p>
+            <w:r>
+              <w:rPr>
+                <w:rFonts w:ascii="Calibri" w:hAnsi="Calibri" w:eastAsia="Calibri"/>
+                <w:b w:val="0"/>
+                <w:i w:val="0"/>
+                <w:sz w:val="20"/>
+              </w:rPr>
+              <w:t>Luồng RTSP — bodycam tuần tra khu vực</w:t>
+            </w:r>
+          </w:p>
+        </w:tc>
+      </w:tr>
+      <w:tr>
+        <w:tc>
+          <w:tcPr>
+            <w:tcW w:type="dxa" w:w="3135"/>
+          </w:tcPr>
+          <w:p>
+            <w:r>
+              <w:rPr>
+                <w:rFonts w:ascii="Calibri" w:hAnsi="Calibri" w:eastAsia="Calibri"/>
+                <w:b w:val="0"/>
+                <w:i w:val="0"/>
+                <w:sz w:val="20"/>
+              </w:rPr>
+              <w:t>Helmet 07</w:t>
+            </w:r>
+          </w:p>
+        </w:tc>
+        <w:tc>
+          <w:tcPr>
+            <w:tcW w:type="dxa" w:w="3135"/>
+          </w:tcPr>
+          <w:p>
+            <w:r>
+              <w:rPr>
+                <w:rFonts w:ascii="Calibri" w:hAnsi="Calibri" w:eastAsia="Calibri"/>
+                <w:b w:val="0"/>
+                <w:i w:val="0"/>
+                <w:sz w:val="20"/>
+              </w:rPr>
+              <w:t>HC-07</w:t>
+            </w:r>
+          </w:p>
+        </w:tc>
+        <w:tc>
+          <w:tcPr>
+            <w:tcW w:type="dxa" w:w="3135"/>
+          </w:tcPr>
+          <w:p>
+            <w:r>
+              <w:rPr>
+                <w:rFonts w:ascii="Calibri" w:hAnsi="Calibri" w:eastAsia="Calibri"/>
+                <w:b w:val="0"/>
+                <w:i w:val="0"/>
+                <w:sz w:val="20"/>
+              </w:rPr>
+              <w:t>Luồng RTSP — bodycam tuần tra khu vực</w:t>
+            </w:r>
+          </w:p>
+        </w:tc>
+      </w:tr>
+      <w:tr>
+        <w:tc>
+          <w:tcPr>
+            <w:tcW w:type="dxa" w:w="3135"/>
+          </w:tcPr>
+          <w:p>
+            <w:r>
+              <w:rPr>
+                <w:rFonts w:ascii="Calibri" w:hAnsi="Calibri" w:eastAsia="Calibri"/>
+                <w:b w:val="0"/>
+                <w:i w:val="0"/>
+                <w:sz w:val="20"/>
+              </w:rPr>
+              <w:t>Helmet 08</w:t>
+            </w:r>
+          </w:p>
+        </w:tc>
+        <w:tc>
+          <w:tcPr>
+            <w:tcW w:type="dxa" w:w="3135"/>
+          </w:tcPr>
+          <w:p>
+            <w:r>
+              <w:rPr>
+                <w:rFonts w:ascii="Calibri" w:hAnsi="Calibri" w:eastAsia="Calibri"/>
+                <w:b w:val="0"/>
+                <w:i w:val="0"/>
+                <w:sz w:val="20"/>
+              </w:rPr>
+              <w:t>HC-08</w:t>
+            </w:r>
+          </w:p>
+        </w:tc>
+        <w:tc>
+          <w:tcPr>
+            <w:tcW w:type="dxa" w:w="3135"/>
+          </w:tcPr>
+          <w:p>
+            <w:r>
+              <w:rPr>
+                <w:rFonts w:ascii="Calibri" w:hAnsi="Calibri" w:eastAsia="Calibri"/>
+                <w:b w:val="0"/>
+                <w:i w:val="0"/>
+                <w:sz w:val="20"/>
+              </w:rPr>
+              <w:t>Luồng RTSP — bodycam tuần tra khu vực</w:t>
+            </w:r>
+          </w:p>
+        </w:tc>
+      </w:tr>
+      <w:tr>
+        <w:tc>
+          <w:tcPr>
+            <w:tcW w:type="dxa" w:w="3135"/>
+          </w:tcPr>
+          <w:p>
+            <w:r>
+              <w:rPr>
+                <w:rFonts w:ascii="Calibri" w:hAnsi="Calibri" w:eastAsia="Calibri"/>
+                <w:b w:val="0"/>
+                <w:i w:val="0"/>
+                <w:sz w:val="20"/>
+              </w:rPr>
+              <w:t>Helmet 09</w:t>
+            </w:r>
+          </w:p>
+        </w:tc>
+        <w:tc>
+          <w:tcPr>
+            <w:tcW w:type="dxa" w:w="3135"/>
+          </w:tcPr>
+          <w:p>
+            <w:r>
+              <w:rPr>
+                <w:rFonts w:ascii="Calibri" w:hAnsi="Calibri" w:eastAsia="Calibri"/>
+                <w:b w:val="0"/>
+                <w:i w:val="0"/>
+                <w:sz w:val="20"/>
+              </w:rPr>
+              <w:t>HC-09</w:t>
+            </w:r>
+          </w:p>
+        </w:tc>
+        <w:tc>
+          <w:tcPr>
+            <w:tcW w:type="dxa" w:w="3135"/>
+          </w:tcPr>
+          <w:p>
+            <w:r>
+              <w:rPr>
+                <w:rFonts w:ascii="Calibri" w:hAnsi="Calibri" w:eastAsia="Calibri"/>
+                <w:b w:val="0"/>
+                <w:i w:val="0"/>
+                <w:sz w:val="20"/>
+              </w:rPr>
+              <w:t>Luồng RTSP — bodycam tuần tra khu vực</w:t>
+            </w:r>
+          </w:p>
+        </w:tc>
+      </w:tr>
+      <w:tr>
+        <w:tc>
+          <w:tcPr>
+            <w:tcW w:type="dxa" w:w="3135"/>
+          </w:tcPr>
+          <w:p>
+            <w:r>
+              <w:rPr>
+                <w:rFonts w:ascii="Calibri" w:hAnsi="Calibri" w:eastAsia="Calibri"/>
+                <w:b w:val="0"/>
+                <w:i w:val="0"/>
+                <w:sz w:val="20"/>
+              </w:rPr>
+              <w:t>Helmet 10</w:t>
+            </w:r>
+          </w:p>
+        </w:tc>
+        <w:tc>
+          <w:tcPr>
+            <w:tcW w:type="dxa" w:w="3135"/>
+          </w:tcPr>
+          <w:p>
+            <w:r>
+              <w:rPr>
+                <w:rFonts w:ascii="Calibri" w:hAnsi="Calibri" w:eastAsia="Calibri"/>
+                <w:b w:val="0"/>
+                <w:i w:val="0"/>
+                <w:sz w:val="20"/>
+              </w:rPr>
+              <w:t>HC-10</w:t>
+            </w:r>
+          </w:p>
+        </w:tc>
+        <w:tc>
+          <w:tcPr>
+            <w:tcW w:type="dxa" w:w="3135"/>
+          </w:tcPr>
+          <w:p>
+            <w:r>
+              <w:rPr>
+                <w:rFonts w:ascii="Calibri" w:hAnsi="Calibri" w:eastAsia="Calibri"/>
+                <w:b w:val="0"/>
+                <w:i w:val="0"/>
+                <w:sz w:val="20"/>
+              </w:rPr>
+              <w:t>Luồng RTSP — bodycam tuần tra khu vực</w:t>
             </w:r>
           </w:p>
         </w:tc>
@@ -541,7 +943,7 @@
         <w:tc>
           <w:tcPr>
             <w:tcW w:type="dxa" w:w="3135"/>
-            <w:shd w:fill="1F3864" w:val="clear"/>
+            <w:shd w:fill="2E5090" w:val="clear"/>
           </w:tcPr>
           <w:p>
             <w:r>
@@ -559,7 +961,7 @@
         <w:tc>
           <w:tcPr>
             <w:tcW w:type="dxa" w:w="3135"/>
-            <w:shd w:fill="1F3864" w:val="clear"/>
+            <w:shd w:fill="2E5090" w:val="clear"/>
           </w:tcPr>
           <w:p>
             <w:r>
@@ -577,7 +979,7 @@
         <w:tc>
           <w:tcPr>
             <w:tcW w:type="dxa" w:w="3135"/>
-            <w:shd w:fill="1F3864" w:val="clear"/>
+            <w:shd w:fill="2E5090" w:val="clear"/>
           </w:tcPr>
           <w:p>
             <w:r>
@@ -638,7 +1040,7 @@
                 <w:i w:val="0"/>
                 <w:sz w:val="20"/>
               </w:rPr>
-              <w:t>Thấy hình người, chưa đủ nhận diện — mỗi lần vào khung = 1 lượt gặp</w:t>
+              <w:t>Thấy hình người, chưa đủ nhận diện — mỗi lần vào khung = 1 lượt gặm</w:t>
             </w:r>
           </w:p>
         </w:tc>
@@ -753,18 +1155,7 @@
           <w:i/>
           <w:sz w:val="22"/>
         </w:rPr>
-        <w:t>Quy ước đếm: Lượt gặm · ĐT ≠ số người. Không trừ Lượt gặm khỏi Nhân sự.</w:t>
-      </w:r>
-    </w:p>
-    <w:p>
-      <w:r>
-        <w:rPr>
-          <w:rFonts w:ascii="Calibri" w:hAnsi="Calibri" w:eastAsia="Calibri"/>
-          <w:b w:val="0"/>
-          <w:i/>
-          <w:sz w:val="22"/>
-        </w:rPr>
-        <w:t>Quy ước ngày: ngày lịch Việt Nam (0h). Dữ liệu lưu 7 ngày gần nhất.</w:t>
+        <w:t>Quy ước: Lượt gặm · ĐT ≠ số người. Ngày lịch VN (0h), lưu 7 ngày.</w:t>
       </w:r>
     </w:p>
     <w:p>
@@ -777,7 +1168,7 @@
         <w:pStyle w:val="Heading1"/>
       </w:pPr>
       <w:r>
-        <w:t>2. Danh sách tính năng theo bố cục màn hình</w:t>
+        <w:t>2. Danh sách tính năng</w:t>
       </w:r>
     </w:p>
     <w:p>
@@ -788,15 +1179,7 @@
           <w:i w:val="0"/>
           <w:sz w:val="22"/>
         </w:rPr>
-        <w:t>Đọc màn hình từ trên xuống dưới. Mỗi tính năng có cùng định dạng: Vị trí · Mục đích · Cách sử dụng · Lưu ý · Trạng thái.</w:t>
-      </w:r>
-    </w:p>
-    <w:p>
-      <w:pPr>
-        <w:pStyle w:val="Heading2"/>
-      </w:pPr>
-      <w:r>
-        <w:t>2.0  Bảng tổng hợp nhanh</w:t>
+        <w:t>Nhóm theo bốn panel trên màn hình /module05. Mỗi tính năng: Vị trí · Mục đích · Cách sử dụng · Lưu ý · Trạng thái.</w:t>
       </w:r>
     </w:p>
     <w:tbl>
@@ -814,7 +1197,7 @@
       <w:tr>
         <w:tc>
           <w:tcPr>
-            <w:tcW w:type="dxa" w:w="850"/>
+            <w:tcW w:type="dxa" w:w="1020"/>
             <w:shd w:fill="2E5090" w:val="clear"/>
           </w:tcPr>
           <w:p>
@@ -823,6 +1206,7 @@
                 <w:rFonts w:ascii="Calibri" w:hAnsi="Calibri" w:eastAsia="Calibri"/>
                 <w:b/>
                 <w:i w:val="0"/>
+                <w:color w:val="FFFFFF"/>
                 <w:sz w:val="20"/>
               </w:rPr>
               <w:t>Mã</w:t>
@@ -831,7 +1215,7 @@
         </w:tc>
         <w:tc>
           <w:tcPr>
-            <w:tcW w:type="dxa" w:w="3118"/>
+            <w:tcW w:type="dxa" w:w="2948"/>
             <w:shd w:fill="2E5090" w:val="clear"/>
           </w:tcPr>
           <w:p>
@@ -840,6 +1224,7 @@
                 <w:rFonts w:ascii="Calibri" w:hAnsi="Calibri" w:eastAsia="Calibri"/>
                 <w:b/>
                 <w:i w:val="0"/>
+                <w:color w:val="FFFFFF"/>
                 <w:sz w:val="20"/>
               </w:rPr>
               <w:t>Tính năng</w:t>
@@ -848,7 +1233,7 @@
         </w:tc>
         <w:tc>
           <w:tcPr>
-            <w:tcW w:type="dxa" w:w="1984"/>
+            <w:tcW w:type="dxa" w:w="1814"/>
             <w:shd w:fill="2E5090" w:val="clear"/>
           </w:tcPr>
           <w:p>
@@ -857,6 +1242,7 @@
                 <w:rFonts w:ascii="Calibri" w:hAnsi="Calibri" w:eastAsia="Calibri"/>
                 <w:b/>
                 <w:i w:val="0"/>
+                <w:color w:val="FFFFFF"/>
                 <w:sz w:val="20"/>
               </w:rPr>
               <w:t>Panel</w:t>
@@ -865,7 +1251,7 @@
         </w:tc>
         <w:tc>
           <w:tcPr>
-            <w:tcW w:type="dxa" w:w="1984"/>
+            <w:tcW w:type="dxa" w:w="1871"/>
             <w:shd w:fill="2E5090" w:val="clear"/>
           </w:tcPr>
           <w:p>
@@ -874,6 +1260,7 @@
                 <w:rFonts w:ascii="Calibri" w:hAnsi="Calibri" w:eastAsia="Calibri"/>
                 <w:b/>
                 <w:i w:val="0"/>
+                <w:color w:val="FFFFFF"/>
                 <w:sz w:val="20"/>
               </w:rPr>
               <w:t>Trạng thái</w:t>
@@ -884,7 +1271,7 @@
       <w:tr>
         <w:tc>
           <w:tcPr>
-            <w:tcW w:type="dxa" w:w="850"/>
+            <w:tcW w:type="dxa" w:w="1020"/>
           </w:tcPr>
           <w:p>
             <w:r>
@@ -894,13 +1281,13 @@
                 <w:i w:val="0"/>
                 <w:sz w:val="20"/>
               </w:rPr>
-              <w:t>F-01</w:t>
-            </w:r>
-          </w:p>
-        </w:tc>
-        <w:tc>
-          <w:tcPr>
-            <w:tcW w:type="dxa" w:w="3118"/>
+              <w:t>TQ-01</w:t>
+            </w:r>
+          </w:p>
+        </w:tc>
+        <w:tc>
+          <w:tcPr>
+            <w:tcW w:type="dxa" w:w="2948"/>
           </w:tcPr>
           <w:p>
             <w:r>
@@ -910,13 +1297,13 @@
                 <w:i w:val="0"/>
                 <w:sz w:val="20"/>
               </w:rPr>
-              <w:t>Tiêu đề trang</w:t>
-            </w:r>
-          </w:p>
-        </w:tc>
-        <w:tc>
-          <w:tcPr>
-            <w:tcW w:type="dxa" w:w="1984"/>
+              <w:t>Khu vực tuần tra</w:t>
+            </w:r>
+          </w:p>
+        </w:tc>
+        <w:tc>
+          <w:tcPr>
+            <w:tcW w:type="dxa" w:w="1814"/>
           </w:tcPr>
           <w:p>
             <w:r>
@@ -926,13 +1313,13 @@
                 <w:i w:val="0"/>
                 <w:sz w:val="20"/>
               </w:rPr>
-              <w:t>Header</w:t>
-            </w:r>
-          </w:p>
-        </w:tc>
-        <w:tc>
-          <w:tcPr>
-            <w:tcW w:type="dxa" w:w="1984"/>
+              <w:t>Tổng quan</w:t>
+            </w:r>
+          </w:p>
+        </w:tc>
+        <w:tc>
+          <w:tcPr>
+            <w:tcW w:type="dxa" w:w="1871"/>
           </w:tcPr>
           <w:p>
             <w:r>
@@ -950,7 +1337,7 @@
       <w:tr>
         <w:tc>
           <w:tcPr>
-            <w:tcW w:type="dxa" w:w="850"/>
+            <w:tcW w:type="dxa" w:w="1020"/>
           </w:tcPr>
           <w:p>
             <w:r>
@@ -960,13 +1347,13 @@
                 <w:i w:val="0"/>
                 <w:sz w:val="20"/>
               </w:rPr>
-              <w:t>F-02</w:t>
-            </w:r>
-          </w:p>
-        </w:tc>
-        <w:tc>
-          <w:tcPr>
-            <w:tcW w:type="dxa" w:w="3118"/>
+              <w:t>TQ-02</w:t>
+            </w:r>
+          </w:p>
+        </w:tc>
+        <w:tc>
+          <w:tcPr>
+            <w:tcW w:type="dxa" w:w="2948"/>
           </w:tcPr>
           <w:p>
             <w:r>
@@ -976,13 +1363,13 @@
                 <w:i w:val="0"/>
                 <w:sz w:val="20"/>
               </w:rPr>
-              <w:t>Khu vực tuần tra</w:t>
-            </w:r>
-          </w:p>
-        </w:tc>
-        <w:tc>
-          <w:tcPr>
-            <w:tcW w:type="dxa" w:w="1984"/>
+              <w:t>Nhân sự</w:t>
+            </w:r>
+          </w:p>
+        </w:tc>
+        <w:tc>
+          <w:tcPr>
+            <w:tcW w:type="dxa" w:w="1814"/>
           </w:tcPr>
           <w:p>
             <w:r>
@@ -992,13 +1379,13 @@
                 <w:i w:val="0"/>
                 <w:sz w:val="20"/>
               </w:rPr>
-              <w:t>Tổng Quan</w:t>
-            </w:r>
-          </w:p>
-        </w:tc>
-        <w:tc>
-          <w:tcPr>
-            <w:tcW w:type="dxa" w:w="1984"/>
+              <w:t>Tổng quan</w:t>
+            </w:r>
+          </w:p>
+        </w:tc>
+        <w:tc>
+          <w:tcPr>
+            <w:tcW w:type="dxa" w:w="1871"/>
           </w:tcPr>
           <w:p>
             <w:r>
@@ -1016,7 +1403,7 @@
       <w:tr>
         <w:tc>
           <w:tcPr>
-            <w:tcW w:type="dxa" w:w="850"/>
+            <w:tcW w:type="dxa" w:w="1020"/>
           </w:tcPr>
           <w:p>
             <w:r>
@@ -1026,13 +1413,13 @@
                 <w:i w:val="0"/>
                 <w:sz w:val="20"/>
               </w:rPr>
-              <w:t>F-03</w:t>
-            </w:r>
-          </w:p>
-        </w:tc>
-        <w:tc>
-          <w:tcPr>
-            <w:tcW w:type="dxa" w:w="3118"/>
+              <w:t>TQ-03</w:t>
+            </w:r>
+          </w:p>
+        </w:tc>
+        <w:tc>
+          <w:tcPr>
+            <w:tcW w:type="dxa" w:w="2948"/>
           </w:tcPr>
           <w:p>
             <w:r>
@@ -1042,13 +1429,13 @@
                 <w:i w:val="0"/>
                 <w:sz w:val="20"/>
               </w:rPr>
-              <w:t>Nhân sự</w:t>
-            </w:r>
-          </w:p>
-        </w:tc>
-        <w:tc>
-          <w:tcPr>
-            <w:tcW w:type="dxa" w:w="1984"/>
+              <w:t>Lượt gặm · ĐT</w:t>
+            </w:r>
+          </w:p>
+        </w:tc>
+        <w:tc>
+          <w:tcPr>
+            <w:tcW w:type="dxa" w:w="1814"/>
           </w:tcPr>
           <w:p>
             <w:r>
@@ -1058,13 +1445,13 @@
                 <w:i w:val="0"/>
                 <w:sz w:val="20"/>
               </w:rPr>
-              <w:t>Tổng Quan</w:t>
-            </w:r>
-          </w:p>
-        </w:tc>
-        <w:tc>
-          <w:tcPr>
-            <w:tcW w:type="dxa" w:w="1984"/>
+              <w:t>Tổng quan</w:t>
+            </w:r>
+          </w:p>
+        </w:tc>
+        <w:tc>
+          <w:tcPr>
+            <w:tcW w:type="dxa" w:w="1871"/>
           </w:tcPr>
           <w:p>
             <w:r>
@@ -1082,7 +1469,7 @@
       <w:tr>
         <w:tc>
           <w:tcPr>
-            <w:tcW w:type="dxa" w:w="850"/>
+            <w:tcW w:type="dxa" w:w="1020"/>
           </w:tcPr>
           <w:p>
             <w:r>
@@ -1092,13 +1479,13 @@
                 <w:i w:val="0"/>
                 <w:sz w:val="20"/>
               </w:rPr>
-              <w:t>F-04</w:t>
-            </w:r>
-          </w:p>
-        </w:tc>
-        <w:tc>
-          <w:tcPr>
-            <w:tcW w:type="dxa" w:w="3118"/>
+              <w:t>TQ-04</w:t>
+            </w:r>
+          </w:p>
+        </w:tc>
+        <w:tc>
+          <w:tcPr>
+            <w:tcW w:type="dxa" w:w="2948"/>
           </w:tcPr>
           <w:p>
             <w:r>
@@ -1108,13 +1495,13 @@
                 <w:i w:val="0"/>
                 <w:sz w:val="20"/>
               </w:rPr>
-              <w:t>Lượt gặm · ĐT</w:t>
-            </w:r>
-          </w:p>
-        </w:tc>
-        <w:tc>
-          <w:tcPr>
-            <w:tcW w:type="dxa" w:w="1984"/>
+              <w:t>Mật độ flymap</w:t>
+            </w:r>
+          </w:p>
+        </w:tc>
+        <w:tc>
+          <w:tcPr>
+            <w:tcW w:type="dxa" w:w="1814"/>
           </w:tcPr>
           <w:p>
             <w:r>
@@ -1124,13 +1511,13 @@
                 <w:i w:val="0"/>
                 <w:sz w:val="20"/>
               </w:rPr>
-              <w:t>Tổng Quan</w:t>
-            </w:r>
-          </w:p>
-        </w:tc>
-        <w:tc>
-          <w:tcPr>
-            <w:tcW w:type="dxa" w:w="1984"/>
+              <w:t>Tổng quan</w:t>
+            </w:r>
+          </w:p>
+        </w:tc>
+        <w:tc>
+          <w:tcPr>
+            <w:tcW w:type="dxa" w:w="1871"/>
           </w:tcPr>
           <w:p>
             <w:r>
@@ -1140,7 +1527,7 @@
                 <w:i w:val="0"/>
                 <w:sz w:val="20"/>
               </w:rPr>
-              <w:t>Sẵn sàng</w:t>
+              <w:t>Cập nhật sau</w:t>
             </w:r>
           </w:p>
         </w:tc>
@@ -1148,7 +1535,7 @@
       <w:tr>
         <w:tc>
           <w:tcPr>
-            <w:tcW w:type="dxa" w:w="850"/>
+            <w:tcW w:type="dxa" w:w="1020"/>
           </w:tcPr>
           <w:p>
             <w:r>
@@ -1158,13 +1545,13 @@
                 <w:i w:val="0"/>
                 <w:sz w:val="20"/>
               </w:rPr>
-              <w:t>F-05</w:t>
-            </w:r>
-          </w:p>
-        </w:tc>
-        <w:tc>
-          <w:tcPr>
-            <w:tcW w:type="dxa" w:w="3118"/>
+              <w:t>TQ-05</w:t>
+            </w:r>
+          </w:p>
+        </w:tc>
+        <w:tc>
+          <w:tcPr>
+            <w:tcW w:type="dxa" w:w="2948"/>
           </w:tcPr>
           <w:p>
             <w:r>
@@ -1174,13 +1561,13 @@
                 <w:i w:val="0"/>
                 <w:sz w:val="20"/>
               </w:rPr>
-              <w:t>Mật độ flymap</w:t>
-            </w:r>
-          </w:p>
-        </w:tc>
-        <w:tc>
-          <w:tcPr>
-            <w:tcW w:type="dxa" w:w="1984"/>
+              <w:t>Thu gọn panel</w:t>
+            </w:r>
+          </w:p>
+        </w:tc>
+        <w:tc>
+          <w:tcPr>
+            <w:tcW w:type="dxa" w:w="1814"/>
           </w:tcPr>
           <w:p>
             <w:r>
@@ -1190,13 +1577,13 @@
                 <w:i w:val="0"/>
                 <w:sz w:val="20"/>
               </w:rPr>
-              <w:t>Tổng Quan</w:t>
-            </w:r>
-          </w:p>
-        </w:tc>
-        <w:tc>
-          <w:tcPr>
-            <w:tcW w:type="dxa" w:w="1984"/>
+              <w:t>Tổng quan</w:t>
+            </w:r>
+          </w:p>
+        </w:tc>
+        <w:tc>
+          <w:tcPr>
+            <w:tcW w:type="dxa" w:w="1871"/>
           </w:tcPr>
           <w:p>
             <w:r>
@@ -1206,7 +1593,7 @@
                 <w:i w:val="0"/>
                 <w:sz w:val="20"/>
               </w:rPr>
-              <w:t>Cập nhật sau</w:t>
+              <w:t>Sẵn sàng</w:t>
             </w:r>
           </w:p>
         </w:tc>
@@ -1214,7 +1601,7 @@
       <w:tr>
         <w:tc>
           <w:tcPr>
-            <w:tcW w:type="dxa" w:w="850"/>
+            <w:tcW w:type="dxa" w:w="1020"/>
           </w:tcPr>
           <w:p>
             <w:r>
@@ -1224,13 +1611,13 @@
                 <w:i w:val="0"/>
                 <w:sz w:val="20"/>
               </w:rPr>
-              <w:t>F-06</w:t>
-            </w:r>
-          </w:p>
-        </w:tc>
-        <w:tc>
-          <w:tcPr>
-            <w:tcW w:type="dxa" w:w="3118"/>
+              <w:t>CAM-01</w:t>
+            </w:r>
+          </w:p>
+        </w:tc>
+        <w:tc>
+          <w:tcPr>
+            <w:tcW w:type="dxa" w:w="2948"/>
           </w:tcPr>
           <w:p>
             <w:r>
@@ -1240,13 +1627,13 @@
                 <w:i w:val="0"/>
                 <w:sz w:val="20"/>
               </w:rPr>
-              <w:t>Thu gọn Tổng Quan</w:t>
-            </w:r>
-          </w:p>
-        </w:tc>
-        <w:tc>
-          <w:tcPr>
-            <w:tcW w:type="dxa" w:w="1984"/>
+              <w:t>Live — lưới 10 mũ RTSP</w:t>
+            </w:r>
+          </w:p>
+        </w:tc>
+        <w:tc>
+          <w:tcPr>
+            <w:tcW w:type="dxa" w:w="1814"/>
           </w:tcPr>
           <w:p>
             <w:r>
@@ -1256,13 +1643,13 @@
                 <w:i w:val="0"/>
                 <w:sz w:val="20"/>
               </w:rPr>
-              <w:t>Tổng Quan</w:t>
-            </w:r>
-          </w:p>
-        </w:tc>
-        <w:tc>
-          <w:tcPr>
-            <w:tcW w:type="dxa" w:w="1984"/>
+              <w:t>Camera</w:t>
+            </w:r>
+          </w:p>
+        </w:tc>
+        <w:tc>
+          <w:tcPr>
+            <w:tcW w:type="dxa" w:w="1871"/>
           </w:tcPr>
           <w:p>
             <w:r>
@@ -1280,7 +1667,7 @@
       <w:tr>
         <w:tc>
           <w:tcPr>
-            <w:tcW w:type="dxa" w:w="850"/>
+            <w:tcW w:type="dxa" w:w="1020"/>
           </w:tcPr>
           <w:p>
             <w:r>
@@ -1290,13 +1677,13 @@
                 <w:i w:val="0"/>
                 <w:sz w:val="20"/>
               </w:rPr>
-              <w:t>F-07</w:t>
-            </w:r>
-          </w:p>
-        </w:tc>
-        <w:tc>
-          <w:tcPr>
-            <w:tcW w:type="dxa" w:w="3118"/>
+              <w:t>CAM-02</w:t>
+            </w:r>
+          </w:p>
+        </w:tc>
+        <w:tc>
+          <w:tcPr>
+            <w:tcW w:type="dxa" w:w="2948"/>
           </w:tcPr>
           <w:p>
             <w:r>
@@ -1306,13 +1693,13 @@
                 <w:i w:val="0"/>
                 <w:sz w:val="20"/>
               </w:rPr>
-              <w:t>Live — lưới camera</w:t>
-            </w:r>
-          </w:p>
-        </w:tc>
-        <w:tc>
-          <w:tcPr>
-            <w:tcW w:type="dxa" w:w="1984"/>
+              <w:t>Live — chọn &amp; focus mũ</w:t>
+            </w:r>
+          </w:p>
+        </w:tc>
+        <w:tc>
+          <w:tcPr>
+            <w:tcW w:type="dxa" w:w="1814"/>
           </w:tcPr>
           <w:p>
             <w:r>
@@ -1328,7 +1715,7 @@
         </w:tc>
         <w:tc>
           <w:tcPr>
-            <w:tcW w:type="dxa" w:w="1984"/>
+            <w:tcW w:type="dxa" w:w="1871"/>
           </w:tcPr>
           <w:p>
             <w:r>
@@ -1346,7 +1733,7 @@
       <w:tr>
         <w:tc>
           <w:tcPr>
-            <w:tcW w:type="dxa" w:w="850"/>
+            <w:tcW w:type="dxa" w:w="1020"/>
           </w:tcPr>
           <w:p>
             <w:r>
@@ -1356,13 +1743,13 @@
                 <w:i w:val="0"/>
                 <w:sz w:val="20"/>
               </w:rPr>
-              <w:t>F-08</w:t>
-            </w:r>
-          </w:p>
-        </w:tc>
-        <w:tc>
-          <w:tcPr>
-            <w:tcW w:type="dxa" w:w="3118"/>
+              <w:t>CAM-03</w:t>
+            </w:r>
+          </w:p>
+        </w:tc>
+        <w:tc>
+          <w:tcPr>
+            <w:tcW w:type="dxa" w:w="2948"/>
           </w:tcPr>
           <w:p>
             <w:r>
@@ -1378,7 +1765,7 @@
         </w:tc>
         <w:tc>
           <w:tcPr>
-            <w:tcW w:type="dxa" w:w="1984"/>
+            <w:tcW w:type="dxa" w:w="1814"/>
           </w:tcPr>
           <w:p>
             <w:r>
@@ -1394,7 +1781,7 @@
         </w:tc>
         <w:tc>
           <w:tcPr>
-            <w:tcW w:type="dxa" w:w="1984"/>
+            <w:tcW w:type="dxa" w:w="1871"/>
           </w:tcPr>
           <w:p>
             <w:r>
@@ -1412,7 +1799,7 @@
       <w:tr>
         <w:tc>
           <w:tcPr>
-            <w:tcW w:type="dxa" w:w="850"/>
+            <w:tcW w:type="dxa" w:w="1020"/>
           </w:tcPr>
           <w:p>
             <w:r>
@@ -1422,13 +1809,13 @@
                 <w:i w:val="0"/>
                 <w:sz w:val="20"/>
               </w:rPr>
-              <w:t>F-09</w:t>
-            </w:r>
-          </w:p>
-        </w:tc>
-        <w:tc>
-          <w:tcPr>
-            <w:tcW w:type="dxa" w:w="3118"/>
+              <w:t>CAM-04</w:t>
+            </w:r>
+          </w:p>
+        </w:tc>
+        <w:tc>
+          <w:tcPr>
+            <w:tcW w:type="dxa" w:w="2948"/>
           </w:tcPr>
           <w:p>
             <w:r>
@@ -1438,13 +1825,13 @@
                 <w:i w:val="0"/>
                 <w:sz w:val="20"/>
               </w:rPr>
-              <w:t>Live — lọc Bodycam</w:t>
-            </w:r>
-          </w:p>
-        </w:tc>
-        <w:tc>
-          <w:tcPr>
-            <w:tcW w:type="dxa" w:w="1984"/>
+              <w:t>Live — thu gọn panel</w:t>
+            </w:r>
+          </w:p>
+        </w:tc>
+        <w:tc>
+          <w:tcPr>
+            <w:tcW w:type="dxa" w:w="1814"/>
           </w:tcPr>
           <w:p>
             <w:r>
@@ -1460,7 +1847,7 @@
         </w:tc>
         <w:tc>
           <w:tcPr>
-            <w:tcW w:type="dxa" w:w="1984"/>
+            <w:tcW w:type="dxa" w:w="1871"/>
           </w:tcPr>
           <w:p>
             <w:r>
@@ -1478,7 +1865,7 @@
       <w:tr>
         <w:tc>
           <w:tcPr>
-            <w:tcW w:type="dxa" w:w="850"/>
+            <w:tcW w:type="dxa" w:w="1020"/>
           </w:tcPr>
           <w:p>
             <w:r>
@@ -1488,13 +1875,13 @@
                 <w:i w:val="0"/>
                 <w:sz w:val="20"/>
               </w:rPr>
-              <w:t>F-10</w:t>
-            </w:r>
-          </w:p>
-        </w:tc>
-        <w:tc>
-          <w:tcPr>
-            <w:tcW w:type="dxa" w:w="3118"/>
+              <w:t>CAM-05</w:t>
+            </w:r>
+          </w:p>
+        </w:tc>
+        <w:tc>
+          <w:tcPr>
+            <w:tcW w:type="dxa" w:w="2948"/>
           </w:tcPr>
           <w:p>
             <w:r>
@@ -1504,13 +1891,13 @@
                 <w:i w:val="0"/>
                 <w:sz w:val="20"/>
               </w:rPr>
-              <w:t>Playback — xem lại</w:t>
-            </w:r>
-          </w:p>
-        </w:tc>
-        <w:tc>
-          <w:tcPr>
-            <w:tcW w:type="dxa" w:w="1984"/>
+              <w:t>Playback — xem lại 7 ngày</w:t>
+            </w:r>
+          </w:p>
+        </w:tc>
+        <w:tc>
+          <w:tcPr>
+            <w:tcW w:type="dxa" w:w="1814"/>
           </w:tcPr>
           <w:p>
             <w:r>
@@ -1526,7 +1913,7 @@
         </w:tc>
         <w:tc>
           <w:tcPr>
-            <w:tcW w:type="dxa" w:w="1984"/>
+            <w:tcW w:type="dxa" w:w="1871"/>
           </w:tcPr>
           <w:p>
             <w:r>
@@ -1544,7 +1931,7 @@
       <w:tr>
         <w:tc>
           <w:tcPr>
-            <w:tcW w:type="dxa" w:w="850"/>
+            <w:tcW w:type="dxa" w:w="1020"/>
           </w:tcPr>
           <w:p>
             <w:r>
@@ -1554,13 +1941,13 @@
                 <w:i w:val="0"/>
                 <w:sz w:val="20"/>
               </w:rPr>
-              <w:t>F-11</w:t>
-            </w:r>
-          </w:p>
-        </w:tc>
-        <w:tc>
-          <w:tcPr>
-            <w:tcW w:type="dxa" w:w="3118"/>
+              <w:t>CAM-06</w:t>
+            </w:r>
+          </w:p>
+        </w:tc>
+        <w:tc>
+          <w:tcPr>
+            <w:tcW w:type="dxa" w:w="2948"/>
           </w:tcPr>
           <w:p>
             <w:r>
@@ -1570,13 +1957,13 @@
                 <w:i w:val="0"/>
                 <w:sz w:val="20"/>
               </w:rPr>
-              <w:t>Heatmap — bản đồ site</w:t>
-            </w:r>
-          </w:p>
-        </w:tc>
-        <w:tc>
-          <w:tcPr>
-            <w:tcW w:type="dxa" w:w="1984"/>
+              <w:t>Flycam trên lưới camera</w:t>
+            </w:r>
+          </w:p>
+        </w:tc>
+        <w:tc>
+          <w:tcPr>
+            <w:tcW w:type="dxa" w:w="1814"/>
           </w:tcPr>
           <w:p>
             <w:r>
@@ -1586,13 +1973,13 @@
                 <w:i w:val="0"/>
                 <w:sz w:val="20"/>
               </w:rPr>
-              <w:t>Heatmap</w:t>
-            </w:r>
-          </w:p>
-        </w:tc>
-        <w:tc>
-          <w:tcPr>
-            <w:tcW w:type="dxa" w:w="1984"/>
+              <w:t>Camera</w:t>
+            </w:r>
+          </w:p>
+        </w:tc>
+        <w:tc>
+          <w:tcPr>
+            <w:tcW w:type="dxa" w:w="1871"/>
           </w:tcPr>
           <w:p>
             <w:r>
@@ -1602,7 +1989,7 @@
                 <w:i w:val="0"/>
                 <w:sz w:val="20"/>
               </w:rPr>
-              <w:t>Sẵn sàng</w:t>
+              <w:t>Cập nhật sau</w:t>
             </w:r>
           </w:p>
         </w:tc>
@@ -1610,7 +1997,7 @@
       <w:tr>
         <w:tc>
           <w:tcPr>
-            <w:tcW w:type="dxa" w:w="850"/>
+            <w:tcW w:type="dxa" w:w="1020"/>
           </w:tcPr>
           <w:p>
             <w:r>
@@ -1620,13 +2007,13 @@
                 <w:i w:val="0"/>
                 <w:sz w:val="20"/>
               </w:rPr>
-              <w:t>F-12</w:t>
-            </w:r>
-          </w:p>
-        </w:tc>
-        <w:tc>
-          <w:tcPr>
-            <w:tcW w:type="dxa" w:w="3118"/>
+              <w:t>MAP-01</w:t>
+            </w:r>
+          </w:p>
+        </w:tc>
+        <w:tc>
+          <w:tcPr>
+            <w:tcW w:type="dxa" w:w="2948"/>
           </w:tcPr>
           <w:p>
             <w:r>
@@ -1636,13 +2023,13 @@
                 <w:i w:val="0"/>
                 <w:sz w:val="20"/>
               </w:rPr>
-              <w:t>Heatmap — gán định danh</w:t>
-            </w:r>
-          </w:p>
-        </w:tc>
-        <w:tc>
-          <w:tcPr>
-            <w:tcW w:type="dxa" w:w="1984"/>
+              <w:t>Bản đồ site &amp; layer</w:t>
+            </w:r>
+          </w:p>
+        </w:tc>
+        <w:tc>
+          <w:tcPr>
+            <w:tcW w:type="dxa" w:w="1814"/>
           </w:tcPr>
           <w:p>
             <w:r>
@@ -1658,7 +2045,7 @@
         </w:tc>
         <w:tc>
           <w:tcPr>
-            <w:tcW w:type="dxa" w:w="1984"/>
+            <w:tcW w:type="dxa" w:w="1871"/>
           </w:tcPr>
           <w:p>
             <w:r>
@@ -1676,7 +2063,7 @@
       <w:tr>
         <w:tc>
           <w:tcPr>
-            <w:tcW w:type="dxa" w:w="850"/>
+            <w:tcW w:type="dxa" w:w="1020"/>
           </w:tcPr>
           <w:p>
             <w:r>
@@ -1686,13 +2073,13 @@
                 <w:i w:val="0"/>
                 <w:sz w:val="20"/>
               </w:rPr>
-              <w:t>F-13</w:t>
-            </w:r>
-          </w:p>
-        </w:tc>
-        <w:tc>
-          <w:tcPr>
-            <w:tcW w:type="dxa" w:w="3118"/>
+              <w:t>MAP-02</w:t>
+            </w:r>
+          </w:p>
+        </w:tc>
+        <w:tc>
+          <w:tcPr>
+            <w:tcW w:type="dxa" w:w="2948"/>
           </w:tcPr>
           <w:p>
             <w:r>
@@ -1702,13 +2089,13 @@
                 <w:i w:val="0"/>
                 <w:sz w:val="20"/>
               </w:rPr>
-              <w:t>Flymap</w:t>
-            </w:r>
-          </w:p>
-        </w:tc>
-        <w:tc>
-          <w:tcPr>
-            <w:tcW w:type="dxa" w:w="1984"/>
+              <w:t>Chấm 3 tier trên map</w:t>
+            </w:r>
+          </w:p>
+        </w:tc>
+        <w:tc>
+          <w:tcPr>
+            <w:tcW w:type="dxa" w:w="1814"/>
           </w:tcPr>
           <w:p>
             <w:r>
@@ -1724,7 +2111,7 @@
         </w:tc>
         <w:tc>
           <w:tcPr>
-            <w:tcW w:type="dxa" w:w="1984"/>
+            <w:tcW w:type="dxa" w:w="1871"/>
           </w:tcPr>
           <w:p>
             <w:r>
@@ -1734,7 +2121,7 @@
                 <w:i w:val="0"/>
                 <w:sz w:val="20"/>
               </w:rPr>
-              <w:t>Cập nhật sau</w:t>
+              <w:t>Sẵn sàng</w:t>
             </w:r>
           </w:p>
         </w:tc>
@@ -1742,7 +2129,7 @@
       <w:tr>
         <w:tc>
           <w:tcPr>
-            <w:tcW w:type="dxa" w:w="850"/>
+            <w:tcW w:type="dxa" w:w="1020"/>
           </w:tcPr>
           <w:p>
             <w:r>
@@ -1752,13 +2139,13 @@
                 <w:i w:val="0"/>
                 <w:sz w:val="20"/>
               </w:rPr>
-              <w:t>F-14</w:t>
-            </w:r>
-          </w:p>
-        </w:tc>
-        <w:tc>
-          <w:tcPr>
-            <w:tcW w:type="dxa" w:w="3118"/>
+              <w:t>MAP-03</w:t>
+            </w:r>
+          </w:p>
+        </w:tc>
+        <w:tc>
+          <w:tcPr>
+            <w:tcW w:type="dxa" w:w="2948"/>
           </w:tcPr>
           <w:p>
             <w:r>
@@ -1768,13 +2155,13 @@
                 <w:i w:val="0"/>
                 <w:sz w:val="20"/>
               </w:rPr>
-              <w:t>Flycam trên camera</w:t>
-            </w:r>
-          </w:p>
-        </w:tc>
-        <w:tc>
-          <w:tcPr>
-            <w:tcW w:type="dxa" w:w="1984"/>
+              <w:t>Lộ trình mũ (10 helmet)</w:t>
+            </w:r>
+          </w:p>
+        </w:tc>
+        <w:tc>
+          <w:tcPr>
+            <w:tcW w:type="dxa" w:w="1814"/>
           </w:tcPr>
           <w:p>
             <w:r>
@@ -1784,13 +2171,13 @@
                 <w:i w:val="0"/>
                 <w:sz w:val="20"/>
               </w:rPr>
-              <w:t>Camera</w:t>
-            </w:r>
-          </w:p>
-        </w:tc>
-        <w:tc>
-          <w:tcPr>
-            <w:tcW w:type="dxa" w:w="1984"/>
+              <w:t>Heatmap</w:t>
+            </w:r>
+          </w:p>
+        </w:tc>
+        <w:tc>
+          <w:tcPr>
+            <w:tcW w:type="dxa" w:w="1871"/>
           </w:tcPr>
           <w:p>
             <w:r>
@@ -1800,7 +2187,7 @@
                 <w:i w:val="0"/>
                 <w:sz w:val="20"/>
               </w:rPr>
-              <w:t>Cập nhật sau</w:t>
+              <w:t>Sẵn sàng</w:t>
             </w:r>
           </w:p>
         </w:tc>
@@ -1808,7 +2195,7 @@
       <w:tr>
         <w:tc>
           <w:tcPr>
-            <w:tcW w:type="dxa" w:w="850"/>
+            <w:tcW w:type="dxa" w:w="1020"/>
           </w:tcPr>
           <w:p>
             <w:r>
@@ -1818,13 +2205,13 @@
                 <w:i w:val="0"/>
                 <w:sz w:val="20"/>
               </w:rPr>
-              <w:t>F-15</w:t>
-            </w:r>
-          </w:p>
-        </w:tc>
-        <w:tc>
-          <w:tcPr>
-            <w:tcW w:type="dxa" w:w="3118"/>
+              <w:t>MAP-04</w:t>
+            </w:r>
+          </w:p>
+        </w:tc>
+        <w:tc>
+          <w:tcPr>
+            <w:tcW w:type="dxa" w:w="2948"/>
           </w:tcPr>
           <w:p>
             <w:r>
@@ -1834,13 +2221,13 @@
                 <w:i w:val="0"/>
                 <w:sz w:val="20"/>
               </w:rPr>
-              <w:t>Chọn ngày</w:t>
-            </w:r>
-          </w:p>
-        </w:tc>
-        <w:tc>
-          <w:tcPr>
-            <w:tcW w:type="dxa" w:w="1984"/>
+              <w:t>Gán định danh từ map</w:t>
+            </w:r>
+          </w:p>
+        </w:tc>
+        <w:tc>
+          <w:tcPr>
+            <w:tcW w:type="dxa" w:w="1814"/>
           </w:tcPr>
           <w:p>
             <w:r>
@@ -1850,13 +2237,13 @@
                 <w:i w:val="0"/>
                 <w:sz w:val="20"/>
               </w:rPr>
-              <w:t>Sự kiện</w:t>
-            </w:r>
-          </w:p>
-        </w:tc>
-        <w:tc>
-          <w:tcPr>
-            <w:tcW w:type="dxa" w:w="1984"/>
+              <w:t>Heatmap</w:t>
+            </w:r>
+          </w:p>
+        </w:tc>
+        <w:tc>
+          <w:tcPr>
+            <w:tcW w:type="dxa" w:w="1871"/>
           </w:tcPr>
           <w:p>
             <w:r>
@@ -1874,7 +2261,7 @@
       <w:tr>
         <w:tc>
           <w:tcPr>
-            <w:tcW w:type="dxa" w:w="850"/>
+            <w:tcW w:type="dxa" w:w="1020"/>
           </w:tcPr>
           <w:p>
             <w:r>
@@ -1884,13 +2271,13 @@
                 <w:i w:val="0"/>
                 <w:sz w:val="20"/>
               </w:rPr>
-              <w:t>F-16</w:t>
-            </w:r>
-          </w:p>
-        </w:tc>
-        <w:tc>
-          <w:tcPr>
-            <w:tcW w:type="dxa" w:w="3118"/>
+              <w:t>MAP-05</w:t>
+            </w:r>
+          </w:p>
+        </w:tc>
+        <w:tc>
+          <w:tcPr>
+            <w:tcW w:type="dxa" w:w="2948"/>
           </w:tcPr>
           <w:p>
             <w:r>
@@ -1900,13 +2287,13 @@
                 <w:i w:val="0"/>
                 <w:sz w:val="20"/>
               </w:rPr>
-              <w:t>Lọc tab</w:t>
-            </w:r>
-          </w:p>
-        </w:tc>
-        <w:tc>
-          <w:tcPr>
-            <w:tcW w:type="dxa" w:w="1984"/>
+              <w:t>Phóng to fullscreen</w:t>
+            </w:r>
+          </w:p>
+        </w:tc>
+        <w:tc>
+          <w:tcPr>
+            <w:tcW w:type="dxa" w:w="1814"/>
           </w:tcPr>
           <w:p>
             <w:r>
@@ -1916,13 +2303,13 @@
                 <w:i w:val="0"/>
                 <w:sz w:val="20"/>
               </w:rPr>
-              <w:t>Sự kiện</w:t>
-            </w:r>
-          </w:p>
-        </w:tc>
-        <w:tc>
-          <w:tcPr>
-            <w:tcW w:type="dxa" w:w="1984"/>
+              <w:t>Heatmap</w:t>
+            </w:r>
+          </w:p>
+        </w:tc>
+        <w:tc>
+          <w:tcPr>
+            <w:tcW w:type="dxa" w:w="1871"/>
           </w:tcPr>
           <w:p>
             <w:r>
@@ -1940,7 +2327,7 @@
       <w:tr>
         <w:tc>
           <w:tcPr>
-            <w:tcW w:type="dxa" w:w="850"/>
+            <w:tcW w:type="dxa" w:w="1020"/>
           </w:tcPr>
           <w:p>
             <w:r>
@@ -1950,13 +2337,13 @@
                 <w:i w:val="0"/>
                 <w:sz w:val="20"/>
               </w:rPr>
-              <w:t>F-17</w:t>
-            </w:r>
-          </w:p>
-        </w:tc>
-        <w:tc>
-          <w:tcPr>
-            <w:tcW w:type="dxa" w:w="3118"/>
+              <w:t>MAP-06</w:t>
+            </w:r>
+          </w:p>
+        </w:tc>
+        <w:tc>
+          <w:tcPr>
+            <w:tcW w:type="dxa" w:w="2948"/>
           </w:tcPr>
           <w:p>
             <w:r>
@@ -1966,13 +2353,13 @@
                 <w:i w:val="0"/>
                 <w:sz w:val="20"/>
               </w:rPr>
-              <w:t>Tìm kiếm</w:t>
-            </w:r>
-          </w:p>
-        </w:tc>
-        <w:tc>
-          <w:tcPr>
-            <w:tcW w:type="dxa" w:w="1984"/>
+              <w:t>Flymap</w:t>
+            </w:r>
+          </w:p>
+        </w:tc>
+        <w:tc>
+          <w:tcPr>
+            <w:tcW w:type="dxa" w:w="1814"/>
           </w:tcPr>
           <w:p>
             <w:r>
@@ -1982,13 +2369,13 @@
                 <w:i w:val="0"/>
                 <w:sz w:val="20"/>
               </w:rPr>
-              <w:t>Sự kiện</w:t>
-            </w:r>
-          </w:p>
-        </w:tc>
-        <w:tc>
-          <w:tcPr>
-            <w:tcW w:type="dxa" w:w="1984"/>
+              <w:t>Heatmap</w:t>
+            </w:r>
+          </w:p>
+        </w:tc>
+        <w:tc>
+          <w:tcPr>
+            <w:tcW w:type="dxa" w:w="1871"/>
           </w:tcPr>
           <w:p>
             <w:r>
@@ -1998,7 +2385,7 @@
                 <w:i w:val="0"/>
                 <w:sz w:val="20"/>
               </w:rPr>
-              <w:t>Sẵn sàng</w:t>
+              <w:t>Cập nhật sau</w:t>
             </w:r>
           </w:p>
         </w:tc>
@@ -2006,7 +2393,7 @@
       <w:tr>
         <w:tc>
           <w:tcPr>
-            <w:tcW w:type="dxa" w:w="850"/>
+            <w:tcW w:type="dxa" w:w="1020"/>
           </w:tcPr>
           <w:p>
             <w:r>
@@ -2016,13 +2403,13 @@
                 <w:i w:val="0"/>
                 <w:sz w:val="20"/>
               </w:rPr>
-              <w:t>F-18</w:t>
-            </w:r>
-          </w:p>
-        </w:tc>
-        <w:tc>
-          <w:tcPr>
-            <w:tcW w:type="dxa" w:w="3118"/>
+              <w:t>EVT-01</w:t>
+            </w:r>
+          </w:p>
+        </w:tc>
+        <w:tc>
+          <w:tcPr>
+            <w:tcW w:type="dxa" w:w="2948"/>
           </w:tcPr>
           <w:p>
             <w:r>
@@ -2032,13 +2419,13 @@
                 <w:i w:val="0"/>
                 <w:sz w:val="20"/>
               </w:rPr>
-              <w:t>Thẻ &amp; popup chi tiết</w:t>
-            </w:r>
-          </w:p>
-        </w:tc>
-        <w:tc>
-          <w:tcPr>
-            <w:tcW w:type="dxa" w:w="1984"/>
+              <w:t>Chọn ngày xem</w:t>
+            </w:r>
+          </w:p>
+        </w:tc>
+        <w:tc>
+          <w:tcPr>
+            <w:tcW w:type="dxa" w:w="1814"/>
           </w:tcPr>
           <w:p>
             <w:r>
@@ -2054,7 +2441,271 @@
         </w:tc>
         <w:tc>
           <w:tcPr>
-            <w:tcW w:type="dxa" w:w="1984"/>
+            <w:tcW w:type="dxa" w:w="1871"/>
+          </w:tcPr>
+          <w:p>
+            <w:r>
+              <w:rPr>
+                <w:rFonts w:ascii="Calibri" w:hAnsi="Calibri" w:eastAsia="Calibri"/>
+                <w:b w:val="0"/>
+                <w:i w:val="0"/>
+                <w:sz w:val="20"/>
+              </w:rPr>
+              <w:t>Sẵn sàng</w:t>
+            </w:r>
+          </w:p>
+        </w:tc>
+      </w:tr>
+      <w:tr>
+        <w:tc>
+          <w:tcPr>
+            <w:tcW w:type="dxa" w:w="1020"/>
+          </w:tcPr>
+          <w:p>
+            <w:r>
+              <w:rPr>
+                <w:rFonts w:ascii="Calibri" w:hAnsi="Calibri" w:eastAsia="Calibri"/>
+                <w:b w:val="0"/>
+                <w:i w:val="0"/>
+                <w:sz w:val="20"/>
+              </w:rPr>
+              <w:t>EVT-02</w:t>
+            </w:r>
+          </w:p>
+        </w:tc>
+        <w:tc>
+          <w:tcPr>
+            <w:tcW w:type="dxa" w:w="2948"/>
+          </w:tcPr>
+          <w:p>
+            <w:r>
+              <w:rPr>
+                <w:rFonts w:ascii="Calibri" w:hAnsi="Calibri" w:eastAsia="Calibri"/>
+                <w:b w:val="0"/>
+                <w:i w:val="0"/>
+                <w:sz w:val="20"/>
+              </w:rPr>
+              <w:t>Lọc tab 4 loại</w:t>
+            </w:r>
+          </w:p>
+        </w:tc>
+        <w:tc>
+          <w:tcPr>
+            <w:tcW w:type="dxa" w:w="1814"/>
+          </w:tcPr>
+          <w:p>
+            <w:r>
+              <w:rPr>
+                <w:rFonts w:ascii="Calibri" w:hAnsi="Calibri" w:eastAsia="Calibri"/>
+                <w:b w:val="0"/>
+                <w:i w:val="0"/>
+                <w:sz w:val="20"/>
+              </w:rPr>
+              <w:t>Sự kiện</w:t>
+            </w:r>
+          </w:p>
+        </w:tc>
+        <w:tc>
+          <w:tcPr>
+            <w:tcW w:type="dxa" w:w="1871"/>
+          </w:tcPr>
+          <w:p>
+            <w:r>
+              <w:rPr>
+                <w:rFonts w:ascii="Calibri" w:hAnsi="Calibri" w:eastAsia="Calibri"/>
+                <w:b w:val="0"/>
+                <w:i w:val="0"/>
+                <w:sz w:val="20"/>
+              </w:rPr>
+              <w:t>Sẵn sàng</w:t>
+            </w:r>
+          </w:p>
+        </w:tc>
+      </w:tr>
+      <w:tr>
+        <w:tc>
+          <w:tcPr>
+            <w:tcW w:type="dxa" w:w="1020"/>
+          </w:tcPr>
+          <w:p>
+            <w:r>
+              <w:rPr>
+                <w:rFonts w:ascii="Calibri" w:hAnsi="Calibri" w:eastAsia="Calibri"/>
+                <w:b w:val="0"/>
+                <w:i w:val="0"/>
+                <w:sz w:val="20"/>
+              </w:rPr>
+              <w:t>EVT-03</w:t>
+            </w:r>
+          </w:p>
+        </w:tc>
+        <w:tc>
+          <w:tcPr>
+            <w:tcW w:type="dxa" w:w="2948"/>
+          </w:tcPr>
+          <w:p>
+            <w:r>
+              <w:rPr>
+                <w:rFonts w:ascii="Calibri" w:hAnsi="Calibri" w:eastAsia="Calibri"/>
+                <w:b w:val="0"/>
+                <w:i w:val="0"/>
+                <w:sz w:val="20"/>
+              </w:rPr>
+              <w:t>Tìm kiếm</w:t>
+            </w:r>
+          </w:p>
+        </w:tc>
+        <w:tc>
+          <w:tcPr>
+            <w:tcW w:type="dxa" w:w="1814"/>
+          </w:tcPr>
+          <w:p>
+            <w:r>
+              <w:rPr>
+                <w:rFonts w:ascii="Calibri" w:hAnsi="Calibri" w:eastAsia="Calibri"/>
+                <w:b w:val="0"/>
+                <w:i w:val="0"/>
+                <w:sz w:val="20"/>
+              </w:rPr>
+              <w:t>Sự kiện</w:t>
+            </w:r>
+          </w:p>
+        </w:tc>
+        <w:tc>
+          <w:tcPr>
+            <w:tcW w:type="dxa" w:w="1871"/>
+          </w:tcPr>
+          <w:p>
+            <w:r>
+              <w:rPr>
+                <w:rFonts w:ascii="Calibri" w:hAnsi="Calibri" w:eastAsia="Calibri"/>
+                <w:b w:val="0"/>
+                <w:i w:val="0"/>
+                <w:sz w:val="20"/>
+              </w:rPr>
+              <w:t>Sẵn sàng</w:t>
+            </w:r>
+          </w:p>
+        </w:tc>
+      </w:tr>
+      <w:tr>
+        <w:tc>
+          <w:tcPr>
+            <w:tcW w:type="dxa" w:w="1020"/>
+          </w:tcPr>
+          <w:p>
+            <w:r>
+              <w:rPr>
+                <w:rFonts w:ascii="Calibri" w:hAnsi="Calibri" w:eastAsia="Calibri"/>
+                <w:b w:val="0"/>
+                <w:i w:val="0"/>
+                <w:sz w:val="20"/>
+              </w:rPr>
+              <w:t>EVT-04</w:t>
+            </w:r>
+          </w:p>
+        </w:tc>
+        <w:tc>
+          <w:tcPr>
+            <w:tcW w:type="dxa" w:w="2948"/>
+          </w:tcPr>
+          <w:p>
+            <w:r>
+              <w:rPr>
+                <w:rFonts w:ascii="Calibri" w:hAnsi="Calibri" w:eastAsia="Calibri"/>
+                <w:b w:val="0"/>
+                <w:i w:val="0"/>
+                <w:sz w:val="20"/>
+              </w:rPr>
+              <w:t>Thẻ sự kiện</w:t>
+            </w:r>
+          </w:p>
+        </w:tc>
+        <w:tc>
+          <w:tcPr>
+            <w:tcW w:type="dxa" w:w="1814"/>
+          </w:tcPr>
+          <w:p>
+            <w:r>
+              <w:rPr>
+                <w:rFonts w:ascii="Calibri" w:hAnsi="Calibri" w:eastAsia="Calibri"/>
+                <w:b w:val="0"/>
+                <w:i w:val="0"/>
+                <w:sz w:val="20"/>
+              </w:rPr>
+              <w:t>Sự kiện</w:t>
+            </w:r>
+          </w:p>
+        </w:tc>
+        <w:tc>
+          <w:tcPr>
+            <w:tcW w:type="dxa" w:w="1871"/>
+          </w:tcPr>
+          <w:p>
+            <w:r>
+              <w:rPr>
+                <w:rFonts w:ascii="Calibri" w:hAnsi="Calibri" w:eastAsia="Calibri"/>
+                <w:b w:val="0"/>
+                <w:i w:val="0"/>
+                <w:sz w:val="20"/>
+              </w:rPr>
+              <w:t>Sẵn sàng</w:t>
+            </w:r>
+          </w:p>
+        </w:tc>
+      </w:tr>
+      <w:tr>
+        <w:tc>
+          <w:tcPr>
+            <w:tcW w:type="dxa" w:w="1020"/>
+          </w:tcPr>
+          <w:p>
+            <w:r>
+              <w:rPr>
+                <w:rFonts w:ascii="Calibri" w:hAnsi="Calibri" w:eastAsia="Calibri"/>
+                <w:b w:val="0"/>
+                <w:i w:val="0"/>
+                <w:sz w:val="20"/>
+              </w:rPr>
+              <w:t>EVT-05</w:t>
+            </w:r>
+          </w:p>
+        </w:tc>
+        <w:tc>
+          <w:tcPr>
+            <w:tcW w:type="dxa" w:w="2948"/>
+          </w:tcPr>
+          <w:p>
+            <w:r>
+              <w:rPr>
+                <w:rFonts w:ascii="Calibri" w:hAnsi="Calibri" w:eastAsia="Calibri"/>
+                <w:b w:val="0"/>
+                <w:i w:val="0"/>
+                <w:sz w:val="20"/>
+              </w:rPr>
+              <w:t>Popup chi tiết</w:t>
+            </w:r>
+          </w:p>
+        </w:tc>
+        <w:tc>
+          <w:tcPr>
+            <w:tcW w:type="dxa" w:w="1814"/>
+          </w:tcPr>
+          <w:p>
+            <w:r>
+              <w:rPr>
+                <w:rFonts w:ascii="Calibri" w:hAnsi="Calibri" w:eastAsia="Calibri"/>
+                <w:b w:val="0"/>
+                <w:i w:val="0"/>
+                <w:sz w:val="20"/>
+              </w:rPr>
+              <w:t>Sự kiện</w:t>
+            </w:r>
+          </w:p>
+        </w:tc>
+        <w:tc>
+          <w:tcPr>
+            <w:tcW w:type="dxa" w:w="1871"/>
           </w:tcPr>
           <w:p>
             <w:r>
@@ -2078,10 +2729,21 @@
     </w:p>
     <w:p>
       <w:pPr>
-        <w:pStyle w:val="Heading2"/>
+        <w:pStyle w:val="Heading1"/>
       </w:pPr>
       <w:r>
-        <w:t>2.1  Tiêu đề trang</w:t>
+        <w:t>2.1  Tổng quan</w:t>
+      </w:r>
+    </w:p>
+    <w:p>
+      <w:r>
+        <w:rPr>
+          <w:rFonts w:ascii="Calibri" w:hAnsi="Calibri" w:eastAsia="Calibri"/>
+          <w:b w:val="0"/>
+          <w:i/>
+          <w:sz w:val="22"/>
+        </w:rPr>
+        <w:t>Panel Tier 1 — bốn thẻ KPI ngay dưới tiêu đề trang.</w:t>
       </w:r>
     </w:p>
     <w:p>
@@ -2089,7 +2751,7 @@
         <w:pStyle w:val="Heading3"/>
       </w:pPr>
       <w:r>
-        <w:t>F-01  Tiêu đề trang</w:t>
+        <w:t>TQ-01  Khu vực tuần tra</w:t>
       </w:r>
     </w:p>
     <w:tbl>
@@ -2132,7 +2794,7 @@
                 <w:i w:val="0"/>
                 <w:sz w:val="20"/>
               </w:rPr>
-              <w:t>Đầu trang /module05</w:t>
+              <w:t>Thẻ KPI thứ 1</w:t>
             </w:r>
           </w:p>
         </w:tc>
@@ -2167,7 +2829,7 @@
                 <w:i w:val="0"/>
                 <w:sz w:val="20"/>
               </w:rPr>
-              <w:t>Xác nhận đang ở module giám sát tuần tra công trường.</w:t>
+              <w:t>Theo dõi bao nhiêu khu trên site có ít nhất một trong 10 mũ online đang phủ.</w:t>
             </w:r>
           </w:p>
         </w:tc>
@@ -2202,9 +2864,11 @@
                 <w:i w:val="0"/>
                 <w:sz w:val="20"/>
               </w:rPr>
-              <w:t>1. Kiểm tra tiêu đề «Hiệu Quả Công Việc».</w:t>
+              <w:t>1. Đọc số X/Y khu vực.</w:t>
               <w:br/>
-              <w:t>2. Đọc dòng phụ «Giám sát tuần tra helmet camera &amp; mật độ lao động».</w:t>
+              <w:t>2. Xem dòng chi tiết: % khu active hoặc «Thiết bị online — chờ xác nhận phủ khu».</w:t>
+              <w:br/>
+              <w:t>3. «Chưa có thiết bị tuần tra online» — kiểm tra mũ đã phát RTSP.</w:t>
             </w:r>
           </w:p>
         </w:tc>
@@ -2249,29 +2913,10 @@
     <w:p/>
     <w:p>
       <w:pPr>
-        <w:pStyle w:val="Heading2"/>
-      </w:pPr>
-      <w:r>
-        <w:t>2.2  Panel Tổng Quan</w:t>
-      </w:r>
-    </w:p>
-    <w:p>
-      <w:r>
-        <w:rPr>
-          <w:rFonts w:ascii="Calibri" w:hAnsi="Calibri" w:eastAsia="Calibri"/>
-          <w:b w:val="0"/>
-          <w:i/>
-          <w:sz w:val="22"/>
-        </w:rPr>
-        <w:t>Tier 1 — bốn thẻ KPI ngay dưới tiêu đề.</w:t>
-      </w:r>
-    </w:p>
-    <w:p>
-      <w:pPr>
         <w:pStyle w:val="Heading3"/>
       </w:pPr>
       <w:r>
-        <w:t>F-02  Khu vực tuần tra</w:t>
+        <w:t>TQ-02  Nhân sự</w:t>
       </w:r>
     </w:p>
     <w:tbl>
@@ -2314,7 +2959,7 @@
                 <w:i w:val="0"/>
                 <w:sz w:val="20"/>
               </w:rPr>
-              <w:t>Thẻ KPI thứ 1 — panel Tổng Quan</w:t>
+              <w:t>Thẻ KPI thứ 2</w:t>
             </w:r>
           </w:p>
         </w:tc>
@@ -2349,7 +2994,7 @@
                 <w:i w:val="0"/>
                 <w:sz w:val="20"/>
               </w:rPr>
-              <w:t>Biết bao nhiêu khu trên site đã có mũ tuần tra online đang phủ.</w:t>
+              <w:t>Tổng headcount ngày = Người + Định danh (từ mọi mũ ghi nhận).</w:t>
             </w:r>
           </w:p>
         </w:tc>
@@ -2384,11 +3029,48 @@
                 <w:i w:val="0"/>
                 <w:sz w:val="20"/>
               </w:rPr>
-              <w:t>1. Đọc số dạng X/Y khu vực.</w:t>
+              <w:t>1. Đọc con số lớn trên thẻ.</w:t>
               <w:br/>
-              <w:t>2. Xem dòng chi tiết: % khu active, hoặc «Thiết bị online — chờ xác nhận phủ khu».</w:t>
+              <w:t>2. Dòng dưới tách icon cam (Người) và xanh lá (Định danh) khi có dữ liệu.</w:t>
               <w:br/>
-              <w:t>3. Nếu «Chưa có thiết bị tuần tra online» — kiểm tra mũ đã bật stream.</w:t>
+              <w:t>3. «Đang tuần tra — chờ phát hiện»: có mũ online, chưa ai vào khung.</w:t>
+              <w:br/>
+              <w:t>4. «Chưa có dữ liệu hôm nay»: chưa phát hiện và không mũ nào online.</w:t>
+            </w:r>
+          </w:p>
+        </w:tc>
+      </w:tr>
+      <w:tr>
+        <w:tc>
+          <w:tcPr>
+            <w:tcW w:type="dxa" w:w="4703"/>
+            <w:shd w:fill="EEF2F7" w:val="clear"/>
+          </w:tcPr>
+          <w:p>
+            <w:r>
+              <w:rPr>
+                <w:rFonts w:ascii="Calibri" w:hAnsi="Calibri" w:eastAsia="Calibri"/>
+                <w:b/>
+                <w:i w:val="0"/>
+                <w:sz w:val="20"/>
+              </w:rPr>
+              <w:t>Lưu ý</w:t>
+            </w:r>
+          </w:p>
+        </w:tc>
+        <w:tc>
+          <w:tcPr>
+            <w:tcW w:type="dxa" w:w="4703"/>
+          </w:tcPr>
+          <w:p>
+            <w:r>
+              <w:rPr>
+                <w:rFonts w:ascii="Calibri" w:hAnsi="Calibri" w:eastAsia="Calibri"/>
+                <w:b w:val="0"/>
+                <w:i w:val="0"/>
+                <w:sz w:val="20"/>
+              </w:rPr>
+              <w:t>Có thể khác badge tab Sự kiện — bình thường.</w:t>
             </w:r>
           </w:p>
         </w:tc>
@@ -2436,7 +3118,7 @@
         <w:pStyle w:val="Heading3"/>
       </w:pPr>
       <w:r>
-        <w:t>F-03  Nhân sự</w:t>
+        <w:t>TQ-03  Lượt gặm · ĐT</w:t>
       </w:r>
     </w:p>
     <w:tbl>
@@ -2479,7 +3161,7 @@
                 <w:i w:val="0"/>
                 <w:sz w:val="20"/>
               </w:rPr>
-              <w:t>Thẻ KPI thứ 2 — panel Tổng Quan</w:t>
+              <w:t>Thẻ KPI thứ 3</w:t>
             </w:r>
           </w:p>
         </w:tc>
@@ -2514,7 +3196,7 @@
                 <w:i w:val="0"/>
                 <w:sz w:val="20"/>
               </w:rPr>
-              <w:t>Tổng headcount ngày = Người + Định danh.</w:t>
+              <w:t>Đếm lần silhouette chưa định danh vào khung (tổng hợp từ 10 mũ).</w:t>
             </w:r>
           </w:p>
         </w:tc>
@@ -2549,13 +3231,9 @@
                 <w:i w:val="0"/>
                 <w:sz w:val="20"/>
               </w:rPr>
-              <w:t>1. Đọc con số lớn trên thẻ.</w:t>
+              <w:t>1. Đọc số lượt — mỗi lần vào khung bất kỳ mũ nào = 1 lượt.</w:t>
               <w:br/>
-              <w:t>2. Khi có dữ liệu: dòng dưới tách icon cam (Người) và xanh lá (Định danh).</w:t>
-              <w:br/>
-              <w:t>3. «Đang tuần tra — chờ phát hiện»: mũ online, chưa ai vào khung.</w:t>
-              <w:br/>
-              <w:t>4. «Chưa có dữ liệu hôm nay»: chưa phát hiện và mũ offline.</w:t>
+              <w:t>2. Peak time: «Peak time — mỗi lần vào khung một lượt, không gộp».</w:t>
             </w:r>
           </w:p>
         </w:tc>
@@ -2590,7 +3268,7 @@
                 <w:i w:val="0"/>
                 <w:sz w:val="20"/>
               </w:rPr>
-              <w:t>Có thể khác badge tab Sự kiện — bình thường.</w:t>
+              <w:t>Không trừ Lượt gặm khỏi Nhân sự.</w:t>
             </w:r>
           </w:p>
         </w:tc>
@@ -2638,7 +3316,7 @@
         <w:pStyle w:val="Heading3"/>
       </w:pPr>
       <w:r>
-        <w:t>F-04  Lượt gặm · ĐT</w:t>
+        <w:t>TQ-04  Mật độ flymap</w:t>
       </w:r>
     </w:p>
     <w:tbl>
@@ -2665,7 +3343,7 @@
                 <w:i w:val="0"/>
                 <w:sz w:val="20"/>
               </w:rPr>
-              <w:t>Vị trí</w:t>
+              <w:t>Phạm vi</w:t>
             </w:r>
           </w:p>
         </w:tc>
@@ -2681,7 +3359,7 @@
                 <w:i w:val="0"/>
                 <w:sz w:val="20"/>
               </w:rPr>
-              <w:t>Thẻ KPI thứ 3 — panel Tổng Quan</w:t>
+              <w:t>Thẻ KPI thứ 4 — mật độ từ flycam (ngoài phạm vi 10 mũ RTSP).</w:t>
             </w:r>
           </w:p>
         </w:tc>
@@ -2700,7 +3378,7 @@
                 <w:i w:val="0"/>
                 <w:sz w:val="20"/>
               </w:rPr>
-              <w:t>Mục đích</w:t>
+              <w:t>Hướng dẫn</w:t>
             </w:r>
           </w:p>
         </w:tc>
@@ -2716,7 +3394,7 @@
                 <w:i w:val="0"/>
                 <w:sz w:val="20"/>
               </w:rPr>
-              <w:t>Đếm lần silhouette chưa định danh vào khung camera.</w:t>
+              <w:t>Nội dung đang được hoàn thiện — bổ sung phiên bản tài liệu tiếp theo.</w:t>
             </w:r>
           </w:p>
         </w:tc>
@@ -2735,7 +3413,7 @@
                 <w:i w:val="0"/>
                 <w:sz w:val="20"/>
               </w:rPr>
-              <w:t>Cách sử dụng</w:t>
+              <w:t>Lưu ý</w:t>
             </w:r>
           </w:p>
         </w:tc>
@@ -2751,11 +3429,7 @@
                 <w:i w:val="0"/>
                 <w:sz w:val="20"/>
               </w:rPr>
-              <w:t>1. Đọc số lượt trên thẻ.</w:t>
-              <w:br/>
-              <w:t>2. Mỗi lần vào khung = 1 lượt — không gộp thành số người.</w:t>
-              <w:br/>
-              <w:t>3. Giờ cao điểm: detail «Peak time — mỗi lần vào khung một lượt, không gộp».</w:t>
+              <w:t>Tạm thời không dùng làm căn cứ vận hành chính thức.</w:t>
             </w:r>
           </w:p>
         </w:tc>
@@ -2774,32 +3448,14 @@
                 <w:i w:val="0"/>
                 <w:sz w:val="20"/>
               </w:rPr>
-              <w:t>Lưu ý</w:t>
+              <w:t>Trạng thái</w:t>
             </w:r>
           </w:p>
         </w:tc>
         <w:tc>
           <w:tcPr>
             <w:tcW w:type="dxa" w:w="4703"/>
-          </w:tcPr>
-          <w:p>
-            <w:r>
-              <w:rPr>
-                <w:rFonts w:ascii="Calibri" w:hAnsi="Calibri" w:eastAsia="Calibri"/>
-                <w:b w:val="0"/>
-                <w:i w:val="0"/>
-                <w:sz w:val="20"/>
-              </w:rPr>
-              <w:t>Không trừ Lượt gặm khỏi Nhân sự.</w:t>
-            </w:r>
-          </w:p>
-        </w:tc>
-      </w:tr>
-      <w:tr>
-        <w:tc>
-          <w:tcPr>
-            <w:tcW w:type="dxa" w:w="4703"/>
-            <w:shd w:fill="EEF2F7" w:val="clear"/>
+            <w:shd w:fill="FFF3CD" w:val="clear"/>
           </w:tcPr>
           <w:p>
             <w:r>
@@ -2809,24 +3465,7 @@
                 <w:i w:val="0"/>
                 <w:sz w:val="20"/>
               </w:rPr>
-              <w:t>Trạng thái</w:t>
-            </w:r>
-          </w:p>
-        </w:tc>
-        <w:tc>
-          <w:tcPr>
-            <w:tcW w:type="dxa" w:w="4703"/>
-            <w:shd w:fill="FFFFFF" w:val="clear"/>
-          </w:tcPr>
-          <w:p>
-            <w:r>
-              <w:rPr>
-                <w:rFonts w:ascii="Calibri" w:hAnsi="Calibri" w:eastAsia="Calibri"/>
-                <w:b/>
-                <w:i w:val="0"/>
-                <w:sz w:val="20"/>
-              </w:rPr>
-              <w:t>Sẵn sàng</w:t>
+              <w:t>Cập nhật sau</w:t>
             </w:r>
           </w:p>
         </w:tc>
@@ -2838,7 +3477,7 @@
         <w:pStyle w:val="Heading3"/>
       </w:pPr>
       <w:r>
-        <w:t>F-05  Mật độ flymap</w:t>
+        <w:t>TQ-05  Thu gọn panel Tổng quan</w:t>
       </w:r>
     </w:p>
     <w:tbl>
@@ -2865,7 +3504,7 @@
                 <w:i w:val="0"/>
                 <w:sz w:val="20"/>
               </w:rPr>
-              <w:t>Phạm vi</w:t>
+              <w:t>Vị trí</w:t>
             </w:r>
           </w:p>
         </w:tc>
@@ -2881,7 +3520,7 @@
                 <w:i w:val="0"/>
                 <w:sz w:val="20"/>
               </w:rPr>
-              <w:t>Thẻ KPI thứ 4 — ước lượng mật độ từ flycam tầm cao (Drone 03).</w:t>
+              <w:t>Nút mũi tên header panel Tổng Quan</w:t>
             </w:r>
           </w:p>
         </w:tc>
@@ -2900,7 +3539,7 @@
                 <w:i w:val="0"/>
                 <w:sz w:val="20"/>
               </w:rPr>
-              <w:t>Hướng dẫn</w:t>
+              <w:t>Mục đích</w:t>
             </w:r>
           </w:p>
         </w:tc>
@@ -2916,7 +3555,7 @@
                 <w:i w:val="0"/>
                 <w:sz w:val="20"/>
               </w:rPr>
-              <w:t>Nội dung đang được hoàn thiện — sẽ bổ sung trong phiên bản tài liệu tiếp theo.</w:t>
+              <w:t>Giải phóng không gian cho Camera / Heatmap / Sự kiện.</w:t>
             </w:r>
           </w:p>
         </w:tc>
@@ -2935,7 +3574,7 @@
                 <w:i w:val="0"/>
                 <w:sz w:val="20"/>
               </w:rPr>
-              <w:t>Lưu ý</w:t>
+              <w:t>Cách sử dụng</w:t>
             </w:r>
           </w:p>
         </w:tc>
@@ -2951,7 +3590,9 @@
                 <w:i w:val="0"/>
                 <w:sz w:val="20"/>
               </w:rPr>
-              <w:t>Tạm thời không sử dụng mục này làm căn cứ vận hành chính thức.</w:t>
+              <w:t>1. Click thu gọn.</w:t>
+              <w:br/>
+              <w:t>2. Click lại để hiện 4 thẻ KPI.</w:t>
             </w:r>
           </w:p>
         </w:tc>
@@ -2977,7 +3618,7 @@
         <w:tc>
           <w:tcPr>
             <w:tcW w:type="dxa" w:w="4703"/>
-            <w:shd w:fill="FFF3CD" w:val="clear"/>
+            <w:shd w:fill="FFFFFF" w:val="clear"/>
           </w:tcPr>
           <w:p>
             <w:r>
@@ -2987,19 +3628,43 @@
                 <w:i w:val="0"/>
                 <w:sz w:val="20"/>
               </w:rPr>
-              <w:t>Cập nhật sau</w:t>
+              <w:t>Sẵn sàng</w:t>
             </w:r>
           </w:p>
         </w:tc>
       </w:tr>
     </w:tbl>
     <w:p/>
+    <w:p>
+      <w:r>
+        <w:br w:type="page"/>
+      </w:r>
+    </w:p>
+    <w:p>
+      <w:pPr>
+        <w:pStyle w:val="Heading1"/>
+      </w:pPr>
+      <w:r>
+        <w:t>2.2  Camera</w:t>
+      </w:r>
+    </w:p>
+    <w:p>
+      <w:r>
+        <w:rPr>
+          <w:rFonts w:ascii="Calibri" w:hAnsi="Calibri" w:eastAsia="Calibri"/>
+          <w:b w:val="0"/>
+          <w:i/>
+          <w:sz w:val="22"/>
+        </w:rPr>
+        <w:t>Panel Tier 2 — toggle Live / Playback. Lưới hiển thị 10 mũ Helmet 01–10.</w:t>
+      </w:r>
+    </w:p>
     <w:p>
       <w:pPr>
         <w:pStyle w:val="Heading3"/>
       </w:pPr>
       <w:r>
-        <w:t>F-06  Thu gọn panel Tổng Quan</w:t>
+        <w:t>CAM-01  Live — lưới 10 mũ RTSP</w:t>
       </w:r>
     </w:p>
     <w:tbl>
@@ -3042,7 +3707,7 @@
                 <w:i w:val="0"/>
                 <w:sz w:val="20"/>
               </w:rPr>
-              <w:t>Nút mũi tên góc phải header panel Tổng Quan</w:t>
+              <w:t>Panel Camera · chế độ Live</w:t>
             </w:r>
           </w:p>
         </w:tc>
@@ -3077,7 +3742,7 @@
                 <w:i w:val="0"/>
                 <w:sz w:val="20"/>
               </w:rPr>
-              <w:t>Giải phóng không gian cho Camera và Heatmap.</w:t>
+              <w:t>Quan sát hiện trường realtime từ 10 luồng RTSP (Helmet 01 – Helmet 10).</w:t>
             </w:r>
           </w:p>
         </w:tc>
@@ -3112,9 +3777,13 @@
                 <w:i w:val="0"/>
                 <w:sz w:val="20"/>
               </w:rPr>
-              <w:t>1. Click nút thu gọn.</w:t>
+              <w:t>1. Mở /module05 — mặc định chế độ Live.</w:t>
               <w:br/>
-              <w:t>2. Click lại để mở rộng — 4 thẻ KPI hiện lại.</w:t>
+              <w:t>2. Lưới hiển thị tile cho từng mũ; cuộn nếu không đủ chỗ trên màn hình.</w:t>
+              <w:br/>
+              <w:t>3. Badge LIVE + chấm nhấp nháy = luồng RTSP đang active.</w:t>
+              <w:br/>
+              <w:t>4. Không badge = mũ offline — hệ thống tự thử kết nối lại.</w:t>
             </w:r>
           </w:p>
         </w:tc>
@@ -3157,36 +3826,12 @@
       </w:tr>
     </w:tbl>
     <w:p/>
-    <w:p>
-      <w:r>
-        <w:br w:type="page"/>
-      </w:r>
-    </w:p>
-    <w:p>
-      <w:pPr>
-        <w:pStyle w:val="Heading2"/>
-      </w:pPr>
-      <w:r>
-        <w:t>2.3  Panel Camera</w:t>
-      </w:r>
-    </w:p>
-    <w:p>
-      <w:r>
-        <w:rPr>
-          <w:rFonts w:ascii="Calibri" w:hAnsi="Calibri" w:eastAsia="Calibri"/>
-          <w:b w:val="0"/>
-          <w:i/>
-          <w:sz w:val="22"/>
-        </w:rPr>
-        <w:t>Tier 2 — toggle Live / Playback ở góc phải header.</w:t>
-      </w:r>
-    </w:p>
     <w:p>
       <w:pPr>
         <w:pStyle w:val="Heading3"/>
       </w:pPr>
       <w:r>
-        <w:t>F-07  Live — lưới camera helmet</w:t>
+        <w:t>CAM-02  Live — chọn &amp; focus mũ</w:t>
       </w:r>
     </w:p>
     <w:tbl>
@@ -3229,7 +3874,7 @@
                 <w:i w:val="0"/>
                 <w:sz w:val="20"/>
               </w:rPr>
-              <w:t>Panel Camera · chế độ Live</w:t>
+              <w:t>Tile camera trên lưới Live</w:t>
             </w:r>
           </w:p>
         </w:tc>
@@ -3264,7 +3909,7 @@
                 <w:i w:val="0"/>
                 <w:sz w:val="20"/>
               </w:rPr>
-              <w:t>Quan sát hiện trường realtime từ Helmet 01 và Helmet 02.</w:t>
+              <w:t>Tập trung xem một mũ cụ thể.</w:t>
             </w:r>
           </w:p>
         </w:tc>
@@ -3299,13 +3944,11 @@
                 <w:i w:val="0"/>
                 <w:sz w:val="20"/>
               </w:rPr>
-              <w:t>1. Mặc định Helmet 02 được chọn (viền highlight).</w:t>
+              <w:t>1. Click tile mũ cần xem — viền highlight.</w:t>
               <w:br/>
-              <w:t>2. Click tile để chuyển camera.</w:t>
+              <w:t>2. Mặc định thường chọn Helmet 02 (có thể đổi tùy cấu hình site).</w:t>
               <w:br/>
-              <w:t>3. Badge LIVE + chấm nhấp nháy = đang có luồng.</w:t>
-              <w:br/>
-              <w:t>4. Không badge = offline — hệ thống tự thử kết nối lại.</w:t>
+              <w:t>3. Sidebar thumbnail: chọn nhanh giữa 10 mũ.</w:t>
             </w:r>
           </w:p>
         </w:tc>
@@ -3353,7 +3996,7 @@
         <w:pStyle w:val="Heading3"/>
       </w:pPr>
       <w:r>
-        <w:t>F-08  Live — khung nhận diện (ROI)</w:t>
+        <w:t>CAM-03  Live — khung nhận diện (ROI)</w:t>
       </w:r>
     </w:p>
     <w:tbl>
@@ -3396,7 +4039,7 @@
                 <w:i w:val="0"/>
                 <w:sz w:val="20"/>
               </w:rPr>
-              <w:t>Trên video tile camera · toolbar</w:t>
+              <w:t>Trên video tile · toolbar</w:t>
             </w:r>
           </w:p>
         </w:tc>
@@ -3466,9 +4109,9 @@
                 <w:i w:val="0"/>
                 <w:sz w:val="20"/>
               </w:rPr>
-              <w:t>1. Bật/tắt khung người bằng nút bbox trên toolbar video.</w:t>
+              <w:t>1. Bật/tắt khung người bằng nút bbox trên toolbar.</w:t>
               <w:br/>
-              <w:t>2. Đọc nhãn trên khung: Đối tượng / Người / Định danh.</w:t>
+              <w:t>2. Nhãn khung: Đối tượng / Người / Định danh.</w:t>
             </w:r>
           </w:p>
         </w:tc>
@@ -3551,7 +4194,7 @@
         <w:pStyle w:val="Heading3"/>
       </w:pPr>
       <w:r>
-        <w:t>F-09  Live — lọc Bodycam</w:t>
+        <w:t>CAM-04  Live — thu gọn panel Camera</w:t>
       </w:r>
     </w:p>
     <w:tbl>
@@ -3594,7 +4237,7 @@
                 <w:i w:val="0"/>
                 <w:sz w:val="20"/>
               </w:rPr>
-              <w:t>Tab filter trên lưới camera</w:t>
+              <w:t>Nút thu gọn header panel Camera</w:t>
             </w:r>
           </w:p>
         </w:tc>
@@ -3629,7 +4272,7 @@
                 <w:i w:val="0"/>
                 <w:sz w:val="20"/>
               </w:rPr>
-              <w:t>Chỉ xem mũ bodycam (Helmet 01, Helmet 02).</w:t>
+              <w:t>Tiết kiệm không gian màn hình.</w:t>
             </w:r>
           </w:p>
         </w:tc>
@@ -3664,9 +4307,9 @@
                 <w:i w:val="0"/>
                 <w:sz w:val="20"/>
               </w:rPr>
-              <w:t>1. Click tab «Bodycam».</w:t>
+              <w:t>1. Click thu gọn — header hiện «X luồng» (số RTSP active).</w:t>
               <w:br/>
-              <w:t>2. Chỉ còn tile HC-01 và HC-02.</w:t>
+              <w:t>2. Phóng to tier Camera (desktop) để xem đủ lưới 10 mũ.</w:t>
             </w:r>
           </w:p>
         </w:tc>
@@ -3714,7 +4357,7 @@
         <w:pStyle w:val="Heading3"/>
       </w:pPr>
       <w:r>
-        <w:t>F-14  Flycam trên camera</w:t>
+        <w:t>CAM-05  Playback — xem lại 7 ngày</w:t>
       </w:r>
     </w:p>
     <w:tbl>
@@ -3741,7 +4384,7 @@
                 <w:i w:val="0"/>
                 <w:sz w:val="20"/>
               </w:rPr>
-              <w:t>Phạm vi</w:t>
+              <w:t>Vị trí</w:t>
             </w:r>
           </w:p>
         </w:tc>
@@ -3757,7 +4400,7 @@
                 <w:i w:val="0"/>
                 <w:sz w:val="20"/>
               </w:rPr>
-              <w:t>Tab Flycam · tile Drone 03 · badge Tầm cao/Tầm thấp · overlay flycam trên lưới Live.</w:t>
+              <w:t>Panel Camera · chế độ Playback</w:t>
             </w:r>
           </w:p>
         </w:tc>
@@ -3776,7 +4419,7 @@
                 <w:i w:val="0"/>
                 <w:sz w:val="20"/>
               </w:rPr>
-              <w:t>Hướng dẫn</w:t>
+              <w:t>Mục đích</w:t>
             </w:r>
           </w:p>
         </w:tc>
@@ -3792,7 +4435,7 @@
                 <w:i w:val="0"/>
                 <w:sz w:val="20"/>
               </w:rPr>
-              <w:t>Nội dung đang được hoàn thiện — sẽ bổ sung trong phiên bản tài liệu tiếp theo.</w:t>
+              <w:t>Xem lại băng ghi RTSP đã lưu (MediaMTX) trong 7 ngày.</w:t>
             </w:r>
           </w:p>
         </w:tc>
@@ -3811,7 +4454,7 @@
                 <w:i w:val="0"/>
                 <w:sz w:val="20"/>
               </w:rPr>
-              <w:t>Lưu ý</w:t>
+              <w:t>Cách sử dụng</w:t>
             </w:r>
           </w:p>
         </w:tc>
@@ -3827,7 +4470,13 @@
                 <w:i w:val="0"/>
                 <w:sz w:val="20"/>
               </w:rPr>
-              <w:t>Tạm thời không sử dụng mục này làm căn cứ vận hành chính thức.</w:t>
+              <w:t>1. Chuyển toggle sang Playback.</w:t>
+              <w:br/>
+              <w:t>2. Chọn ngày — đồng bộ với panel Sự kiện.</w:t>
+              <w:br/>
+              <w:t>3. Chọn mũ (Helmet 01–10) trên sidebar.</w:t>
+              <w:br/>
+              <w:t>4. Kéo timeline hoặc click marker sự kiện → clip ~30 giây.</w:t>
             </w:r>
           </w:p>
         </w:tc>
@@ -3846,6 +4495,41 @@
                 <w:i w:val="0"/>
                 <w:sz w:val="20"/>
               </w:rPr>
+              <w:t>Lưu ý</w:t>
+            </w:r>
+          </w:p>
+        </w:tc>
+        <w:tc>
+          <w:tcPr>
+            <w:tcW w:type="dxa" w:w="4703"/>
+          </w:tcPr>
+          <w:p>
+            <w:r>
+              <w:rPr>
+                <w:rFonts w:ascii="Calibri" w:hAnsi="Calibri" w:eastAsia="Calibri"/>
+                <w:b w:val="0"/>
+                <w:i w:val="0"/>
+                <w:sz w:val="20"/>
+              </w:rPr>
+              <w:t>Ngày tính 0h Việt Nam.</w:t>
+            </w:r>
+          </w:p>
+        </w:tc>
+      </w:tr>
+      <w:tr>
+        <w:tc>
+          <w:tcPr>
+            <w:tcW w:type="dxa" w:w="4703"/>
+            <w:shd w:fill="EEF2F7" w:val="clear"/>
+          </w:tcPr>
+          <w:p>
+            <w:r>
+              <w:rPr>
+                <w:rFonts w:ascii="Calibri" w:hAnsi="Calibri" w:eastAsia="Calibri"/>
+                <w:b/>
+                <w:i w:val="0"/>
+                <w:sz w:val="20"/>
+              </w:rPr>
               <w:t>Trạng thái</w:t>
             </w:r>
           </w:p>
@@ -3853,7 +4537,7 @@
         <w:tc>
           <w:tcPr>
             <w:tcW w:type="dxa" w:w="4703"/>
-            <w:shd w:fill="FFF3CD" w:val="clear"/>
+            <w:shd w:fill="FFFFFF" w:val="clear"/>
           </w:tcPr>
           <w:p>
             <w:r>
@@ -3863,7 +4547,7 @@
                 <w:i w:val="0"/>
                 <w:sz w:val="20"/>
               </w:rPr>
-              <w:t>Cập nhật sau</w:t>
+              <w:t>Sẵn sàng</w:t>
             </w:r>
           </w:p>
         </w:tc>
@@ -3875,7 +4559,7 @@
         <w:pStyle w:val="Heading3"/>
       </w:pPr>
       <w:r>
-        <w:t>F-10  Playback — xem lại</w:t>
+        <w:t>CAM-06  Flycam trên lưới camera</w:t>
       </w:r>
     </w:p>
     <w:tbl>
@@ -3902,7 +4586,7 @@
                 <w:i w:val="0"/>
                 <w:sz w:val="20"/>
               </w:rPr>
-              <w:t>Vị trí</w:t>
+              <w:t>Phạm vi</w:t>
             </w:r>
           </w:p>
         </w:tc>
@@ -3918,7 +4602,7 @@
                 <w:i w:val="0"/>
                 <w:sz w:val="20"/>
               </w:rPr>
-              <w:t>Panel Camera · chế độ Playback</w:t>
+              <w:t>Tab / tile flycam trên panel Camera — ngoài 10 mũ RTSP.</w:t>
             </w:r>
           </w:p>
         </w:tc>
@@ -3937,7 +4621,7 @@
                 <w:i w:val="0"/>
                 <w:sz w:val="20"/>
               </w:rPr>
-              <w:t>Mục đích</w:t>
+              <w:t>Hướng dẫn</w:t>
             </w:r>
           </w:p>
         </w:tc>
@@ -3953,7 +4637,7 @@
                 <w:i w:val="0"/>
                 <w:sz w:val="20"/>
               </w:rPr>
-              <w:t>Xem lại video đã ghi trong 7 ngày.</w:t>
+              <w:t>Nội dung đang được hoàn thiện — bổ sung phiên bản tài liệu tiếp theo.</w:t>
             </w:r>
           </w:p>
         </w:tc>
@@ -3972,7 +4656,7 @@
                 <w:i w:val="0"/>
                 <w:sz w:val="20"/>
               </w:rPr>
-              <w:t>Cách sử dụng</w:t>
+              <w:t>Lưu ý</w:t>
             </w:r>
           </w:p>
         </w:tc>
@@ -3988,13 +4672,7 @@
                 <w:i w:val="0"/>
                 <w:sz w:val="20"/>
               </w:rPr>
-              <w:t>1. Chuyển toggle sang Playback.</w:t>
-              <w:br/>
-              <w:t>2. Chọn ngày — đồng bộ với panel Sự kiện.</w:t>
-              <w:br/>
-              <w:t>3. Chọn camera sidebar · kéo timeline hoặc click marker sự kiện.</w:t>
-              <w:br/>
-              <w:t>4. Click marker → phát clip ~30 giây quanh thời điểm ghi nhận.</w:t>
+              <w:t>Tạm thời không dùng làm căn cứ vận hành chính thức.</w:t>
             </w:r>
           </w:p>
         </w:tc>
@@ -4013,32 +4691,14 @@
                 <w:i w:val="0"/>
                 <w:sz w:val="20"/>
               </w:rPr>
-              <w:t>Lưu ý</w:t>
+              <w:t>Trạng thái</w:t>
             </w:r>
           </w:p>
         </w:tc>
         <w:tc>
           <w:tcPr>
             <w:tcW w:type="dxa" w:w="4703"/>
-          </w:tcPr>
-          <w:p>
-            <w:r>
-              <w:rPr>
-                <w:rFonts w:ascii="Calibri" w:hAnsi="Calibri" w:eastAsia="Calibri"/>
-                <w:b w:val="0"/>
-                <w:i w:val="0"/>
-                <w:sz w:val="20"/>
-              </w:rPr>
-              <w:t>Ngày tính 0h Việt Nam.</w:t>
-            </w:r>
-          </w:p>
-        </w:tc>
-      </w:tr>
-      <w:tr>
-        <w:tc>
-          <w:tcPr>
-            <w:tcW w:type="dxa" w:w="4703"/>
-            <w:shd w:fill="EEF2F7" w:val="clear"/>
+            <w:shd w:fill="FFF3CD" w:val="clear"/>
           </w:tcPr>
           <w:p>
             <w:r>
@@ -4048,24 +4708,7 @@
                 <w:i w:val="0"/>
                 <w:sz w:val="20"/>
               </w:rPr>
-              <w:t>Trạng thái</w:t>
-            </w:r>
-          </w:p>
-        </w:tc>
-        <w:tc>
-          <w:tcPr>
-            <w:tcW w:type="dxa" w:w="4703"/>
-            <w:shd w:fill="FFFFFF" w:val="clear"/>
-          </w:tcPr>
-          <w:p>
-            <w:r>
-              <w:rPr>
-                <w:rFonts w:ascii="Calibri" w:hAnsi="Calibri" w:eastAsia="Calibri"/>
-                <w:b/>
-                <w:i w:val="0"/>
-                <w:sz w:val="20"/>
-              </w:rPr>
-              <w:t>Sẵn sàng</w:t>
+              <w:t>Cập nhật sau</w:t>
             </w:r>
           </w:p>
         </w:tc>
@@ -4079,10 +4722,10 @@
     </w:p>
     <w:p>
       <w:pPr>
-        <w:pStyle w:val="Heading2"/>
+        <w:pStyle w:val="Heading1"/>
       </w:pPr>
       <w:r>
-        <w:t>2.4  Panel Heatmap</w:t>
+        <w:t>2.3  Heatmap</w:t>
       </w:r>
     </w:p>
     <w:p>
@@ -4093,7 +4736,7 @@
           <w:i/>
           <w:sz w:val="22"/>
         </w:rPr>
-        <w:t>Tier 3 trái — bản đồ site Cầu Sông Hốt.</w:t>
+        <w:t>Panel Tier 3 trái — bản đồ site Cầu Sông Hốt.</w:t>
       </w:r>
     </w:p>
     <w:p>
@@ -4101,7 +4744,7 @@
         <w:pStyle w:val="Heading3"/>
       </w:pPr>
       <w:r>
-        <w:t>F-11  Heatmap — bản đồ site</w:t>
+        <w:t>MAP-01  Bản đồ site &amp; layer</w:t>
       </w:r>
     </w:p>
     <w:tbl>
@@ -4144,7 +4787,7 @@
                 <w:i w:val="0"/>
                 <w:sz w:val="20"/>
               </w:rPr>
-              <w:t>Panel HEATMAP (mặc định)</w:t>
+              <w:t>Panel HEATMAP</w:t>
             </w:r>
           </w:p>
         </w:tc>
@@ -4179,7 +4822,7 @@
                 <w:i w:val="0"/>
                 <w:sz w:val="20"/>
               </w:rPr>
-              <w:t>Theo dõi vị trí phát hiện và lộ trình mũ trên site.</w:t>
+              <w:t>Theo dõi phát hiện và thiết bị trên site.</w:t>
             </w:r>
           </w:p>
         </w:tc>
@@ -4216,11 +4859,9 @@
               </w:rPr>
               <w:t>1. Bật/tắt layer: Khu vực · Mật độ · Mũ.</w:t>
               <w:br/>
-              <w:t>2. Chấm xám = Đối tượng, cam = Người, xanh lá = Định danh.</w:t>
+              <w:t>2. Khu vực: viền polygon site.</w:t>
               <w:br/>
-              <w:t>3. Góc map: đếm 3 loại — khớp KPI Tổng Quan.</w:t>
-              <w:br/>
-              <w:t>4. Nút phóng to header → fullscreen; Escape để thoát.</w:t>
+              <w:t>3. Mật độ: chấm presences theo tier.</w:t>
             </w:r>
           </w:p>
         </w:tc>
@@ -4268,7 +4909,7 @@
         <w:pStyle w:val="Heading3"/>
       </w:pPr>
       <w:r>
-        <w:t>F-12  Heatmap — gán định danh thủ công</w:t>
+        <w:t>MAP-02  Chấm 3 tier trên map</w:t>
       </w:r>
     </w:p>
     <w:tbl>
@@ -4311,7 +4952,7 @@
                 <w:i w:val="0"/>
                 <w:sz w:val="20"/>
               </w:rPr>
-              <w:t>Click chấm trên bản đồ → sheet phía dưới</w:t>
+              <w:t>Layer Mật độ</w:t>
             </w:r>
           </w:p>
         </w:tc>
@@ -4346,7 +4987,7 @@
                 <w:i w:val="0"/>
                 <w:sz w:val="20"/>
               </w:rPr>
-              <w:t>Gán tên / mã NV cho đối tượng xám khi nhận ra thủ công.</w:t>
+              <w:t>Vị trí GPS các lần phát hiện — khớp KPI Tổng quan.</w:t>
             </w:r>
           </w:p>
         </w:tc>
@@ -4381,11 +5022,13 @@
                 <w:i w:val="0"/>
                 <w:sz w:val="20"/>
               </w:rPr>
-              <w:t>1. Click chấm xám trên map.</w:t>
+              <w:t>1. Chấm xám = Đối tượng (lượt gặm).</w:t>
               <w:br/>
-              <w:t>2. Nhập mã NV hoặc chọn gợi ý trong panel gán.</w:t>
+              <w:t>2. Chấm cam = Người.</w:t>
               <w:br/>
-              <w:t>3. Sau đồng bộ: chấm và thẻ sự kiện chuyển sang Định danh.</w:t>
+              <w:t>3. Chấm xanh lá = Định danh.</w:t>
+              <w:br/>
+              <w:t>4. Góc map: overlay đếm 3 loại.</w:t>
             </w:r>
           </w:p>
         </w:tc>
@@ -4433,7 +5076,7 @@
         <w:pStyle w:val="Heading3"/>
       </w:pPr>
       <w:r>
-        <w:t>F-13  Flymap</w:t>
+        <w:t>MAP-03  Lộ trình mũ (10 helmet)</w:t>
       </w:r>
     </w:p>
     <w:tbl>
@@ -4460,7 +5103,7 @@
                 <w:i w:val="0"/>
                 <w:sz w:val="20"/>
               </w:rPr>
-              <w:t>Phạm vi</w:t>
+              <w:t>Vị trí</w:t>
             </w:r>
           </w:p>
         </w:tc>
@@ -4476,7 +5119,7 @@
                 <w:i w:val="0"/>
                 <w:sz w:val="20"/>
               </w:rPr>
-              <w:t>Nút Flymap trên header panel map · chế độ FLYMAP · layer Drone · overlay Phát hiện · KPI Mật độ flymap.</w:t>
+              <w:t>Layer Mũ</w:t>
             </w:r>
           </w:p>
         </w:tc>
@@ -4495,7 +5138,7 @@
                 <w:i w:val="0"/>
                 <w:sz w:val="20"/>
               </w:rPr>
-              <w:t>Hướng dẫn</w:t>
+              <w:t>Mục đích</w:t>
             </w:r>
           </w:p>
         </w:tc>
@@ -4511,7 +5154,7 @@
                 <w:i w:val="0"/>
                 <w:sz w:val="20"/>
               </w:rPr>
-              <w:t>Nội dung đang được hoàn thiện — sẽ bổ sung trong phiên bản tài liệu tiếp theo.</w:t>
+              <w:t>Theo dõi vị trí &amp; route của 10 mũ đang online.</w:t>
             </w:r>
           </w:p>
         </w:tc>
@@ -4530,7 +5173,7 @@
                 <w:i w:val="0"/>
                 <w:sz w:val="20"/>
               </w:rPr>
-              <w:t>Lưu ý</w:t>
+              <w:t>Cách sử dụng</w:t>
             </w:r>
           </w:p>
         </w:tc>
@@ -4546,7 +5189,11 @@
                 <w:i w:val="0"/>
                 <w:sz w:val="20"/>
               </w:rPr>
-              <w:t>Tạm thời không sử dụng mục này làm căn cứ vận hành chính thức.</w:t>
+              <w:t>1. Bật layer Mũ.</w:t>
+              <w:br/>
+              <w:t>2. Marker + route cho từng Helmet 01–10 có GPS và online.</w:t>
+              <w:br/>
+              <w:t>3. Map có thể pan theo GPS mũ đang focus (tùy mũ active).</w:t>
             </w:r>
           </w:p>
         </w:tc>
@@ -4572,7 +5219,7 @@
         <w:tc>
           <w:tcPr>
             <w:tcW w:type="dxa" w:w="4703"/>
-            <w:shd w:fill="FFF3CD" w:val="clear"/>
+            <w:shd w:fill="FFFFFF" w:val="clear"/>
           </w:tcPr>
           <w:p>
             <w:r>
@@ -4582,43 +5229,19 @@
                 <w:i w:val="0"/>
                 <w:sz w:val="20"/>
               </w:rPr>
-              <w:t>Cập nhật sau</w:t>
+              <w:t>Sẵn sàng</w:t>
             </w:r>
           </w:p>
         </w:tc>
       </w:tr>
     </w:tbl>
     <w:p/>
-    <w:p>
-      <w:r>
-        <w:br w:type="page"/>
-      </w:r>
-    </w:p>
-    <w:p>
-      <w:pPr>
-        <w:pStyle w:val="Heading2"/>
-      </w:pPr>
-      <w:r>
-        <w:t>2.5  Panel Sự kiện</w:t>
-      </w:r>
-    </w:p>
-    <w:p>
-      <w:r>
-        <w:rPr>
-          <w:rFonts w:ascii="Calibri" w:hAnsi="Calibri" w:eastAsia="Calibri"/>
-          <w:b w:val="0"/>
-          <w:i/>
-          <w:sz w:val="22"/>
-        </w:rPr>
-        <w:t>Tier 3 phải — danh sách bằng chứng hình ảnh trong ngày.</w:t>
-      </w:r>
-    </w:p>
     <w:p>
       <w:pPr>
         <w:pStyle w:val="Heading3"/>
       </w:pPr>
       <w:r>
-        <w:t>F-15  Chọn ngày xem</w:t>
+        <w:t>MAP-04  Gán định danh từ map</w:t>
       </w:r>
     </w:p>
     <w:tbl>
@@ -4661,7 +5284,7 @@
                 <w:i w:val="0"/>
                 <w:sz w:val="20"/>
               </w:rPr>
-              <w:t>Date picker phía trên danh sách thẻ</w:t>
+              <w:t>Click chấm → sheet dưới map</w:t>
             </w:r>
           </w:p>
         </w:tc>
@@ -4696,7 +5319,7 @@
                 <w:i w:val="0"/>
                 <w:sz w:val="20"/>
               </w:rPr>
-              <w:t>Tra cứu sự kiện theo ngày lịch.</w:t>
+              <w:t>Gán mã NV cho đối tượng xám khi nhận ra thủ công.</w:t>
             </w:r>
           </w:p>
         </w:tc>
@@ -4731,11 +5354,11 @@
                 <w:i w:val="0"/>
                 <w:sz w:val="20"/>
               </w:rPr>
-              <w:t>1. Dùng mũi tên hoặc lịch compact.</w:t>
+              <w:t>1. Click chấm xám.</w:t>
               <w:br/>
-              <w:t>2. Phạm vi: 7 ngày gần nhất.</w:t>
+              <w:t>2. Nhập mã NV / chọn gợi ý trong panel gán.</w:t>
               <w:br/>
-              <w:t>3. «Đang xem ngày trước» khi không phải hôm nay.</w:t>
+              <w:t>3. Sau đồng bộ: chấm và thẻ sự kiện chuyển Định danh.</w:t>
             </w:r>
           </w:p>
         </w:tc>
@@ -4783,7 +5406,7 @@
         <w:pStyle w:val="Heading3"/>
       </w:pPr>
       <w:r>
-        <w:t>F-16  Lọc theo tab</w:t>
+        <w:t>MAP-05  Phóng to fullscreen</w:t>
       </w:r>
     </w:p>
     <w:tbl>
@@ -4826,7 +5449,7 @@
                 <w:i w:val="0"/>
                 <w:sz w:val="20"/>
               </w:rPr>
-              <w:t>Thanh tab dưới date picker</w:t>
+              <w:t>Nút phóng to header panel Heatmap</w:t>
             </w:r>
           </w:p>
         </w:tc>
@@ -4861,7 +5484,7 @@
                 <w:i w:val="0"/>
                 <w:sz w:val="20"/>
               </w:rPr>
-              <w:t>Lọc nhanh theo mức nhận diện.</w:t>
+              <w:t>Xem bản đồ toàn màn hình.</w:t>
             </w:r>
           </w:p>
         </w:tc>
@@ -4896,15 +5519,9 @@
                 <w:i w:val="0"/>
                 <w:sz w:val="20"/>
               </w:rPr>
-              <w:t>1. Tất cả — mọi thẻ có ảnh.</w:t>
+              <w:t>1. Click phóng to.</w:t>
               <w:br/>
-              <w:t>2. Đối tượng — silhouette chưa nhận diện.</w:t>
-              <w:br/>
-              <w:t>3. Người — có mặt, chưa biết tên.</w:t>
-              <w:br/>
-              <w:t>4. Định danh — đã có tên / mã NV.</w:t>
-              <w:br/>
-              <w:t>5. Badge = số thẻ trong tab.</w:t>
+              <w:t>2. Escape hoặc nút thu nhỏ để thoát — giữ nguyên layer đang bật.</w:t>
             </w:r>
           </w:p>
         </w:tc>
@@ -4952,7 +5569,7 @@
         <w:pStyle w:val="Heading3"/>
       </w:pPr>
       <w:r>
-        <w:t>F-17  Tìm kiếm</w:t>
+        <w:t>MAP-06  Flymap</w:t>
       </w:r>
     </w:p>
     <w:tbl>
@@ -4979,7 +5596,7 @@
                 <w:i w:val="0"/>
                 <w:sz w:val="20"/>
               </w:rPr>
-              <w:t>Vị trí</w:t>
+              <w:t>Phạm vi</w:t>
             </w:r>
           </w:p>
         </w:tc>
@@ -4995,7 +5612,7 @@
                 <w:i w:val="0"/>
                 <w:sz w:val="20"/>
               </w:rPr>
-              <w:t>Ô tìm dưới thanh tab</w:t>
+              <w:t>Chế độ FLYMAP · overlay flycam · KPI Mật độ flymap.</w:t>
             </w:r>
           </w:p>
         </w:tc>
@@ -5014,7 +5631,7 @@
                 <w:i w:val="0"/>
                 <w:sz w:val="20"/>
               </w:rPr>
-              <w:t>Mục đích</w:t>
+              <w:t>Hướng dẫn</w:t>
             </w:r>
           </w:p>
         </w:tc>
@@ -5030,7 +5647,7 @@
                 <w:i w:val="0"/>
                 <w:sz w:val="20"/>
               </w:rPr>
-              <w:t>Tìm người cụ thể trong danh sách.</w:t>
+              <w:t>Nội dung đang được hoàn thiện — bổ sung phiên bản tài liệu tiếp theo.</w:t>
             </w:r>
           </w:p>
         </w:tc>
@@ -5049,7 +5666,7 @@
                 <w:i w:val="0"/>
                 <w:sz w:val="20"/>
               </w:rPr>
-              <w:t>Cách sử dụng</w:t>
+              <w:t>Lưu ý</w:t>
             </w:r>
           </w:p>
         </w:tc>
@@ -5065,9 +5682,7 @@
                 <w:i w:val="0"/>
                 <w:sz w:val="20"/>
               </w:rPr>
-              <w:t>1. Gõ tên, mã NV, hoặc pers_id.</w:t>
-              <w:br/>
-              <w:t>2. Danh sách lọc sau ~0,3 giây khi ngừng gõ.</w:t>
+              <w:t>Tạm thời không dùng làm căn cứ vận hành chính thức.</w:t>
             </w:r>
           </w:p>
         </w:tc>
@@ -5093,7 +5708,7 @@
         <w:tc>
           <w:tcPr>
             <w:tcW w:type="dxa" w:w="4703"/>
-            <w:shd w:fill="FFFFFF" w:val="clear"/>
+            <w:shd w:fill="FFF3CD" w:val="clear"/>
           </w:tcPr>
           <w:p>
             <w:r>
@@ -5103,19 +5718,43 @@
                 <w:i w:val="0"/>
                 <w:sz w:val="20"/>
               </w:rPr>
-              <w:t>Sẵn sàng</w:t>
+              <w:t>Cập nhật sau</w:t>
             </w:r>
           </w:p>
         </w:tc>
       </w:tr>
     </w:tbl>
     <w:p/>
+    <w:p>
+      <w:r>
+        <w:br w:type="page"/>
+      </w:r>
+    </w:p>
+    <w:p>
+      <w:pPr>
+        <w:pStyle w:val="Heading1"/>
+      </w:pPr>
+      <w:r>
+        <w:t>2.4  Sự kiện</w:t>
+      </w:r>
+    </w:p>
+    <w:p>
+      <w:r>
+        <w:rPr>
+          <w:rFonts w:ascii="Calibri" w:hAnsi="Calibri" w:eastAsia="Calibri"/>
+          <w:b w:val="0"/>
+          <w:i/>
+          <w:sz w:val="22"/>
+        </w:rPr>
+        <w:t>Panel Tier 3 phải — bằng chứng hình ảnh trong ngày (tổng hợp từ 10 mũ).</w:t>
+      </w:r>
+    </w:p>
     <w:p>
       <w:pPr>
         <w:pStyle w:val="Heading3"/>
       </w:pPr>
       <w:r>
-        <w:t>F-18  Thẻ sự kiện &amp; popup chi tiết</w:t>
+        <w:t>EVT-01  Chọn ngày xem</w:t>
       </w:r>
     </w:p>
     <w:tbl>
@@ -5158,7 +5797,7 @@
                 <w:i w:val="0"/>
                 <w:sz w:val="20"/>
               </w:rPr>
-              <w:t>Danh sách thẻ · popup overlay</w:t>
+              <w:t>Date picker trên panel Sự kiện</w:t>
             </w:r>
           </w:p>
         </w:tc>
@@ -5193,7 +5832,7 @@
                 <w:i w:val="0"/>
                 <w:sz w:val="20"/>
               </w:rPr>
-              <w:t>Xem ảnh, thời gian, vị trí; mở playback tương ứng.</w:t>
+              <w:t>Tra cứu sự kiện theo ngày lịch.</w:t>
             </w:r>
           </w:p>
         </w:tc>
@@ -5228,15 +5867,704 @@
                 <w:i w:val="0"/>
                 <w:sz w:val="20"/>
               </w:rPr>
-              <w:t>1. Mỗi thẻ: badge tier, thumbnail, tên, giờ, camera/khu.</w:t>
+              <w:t>1. Dùng mũi tên hoặc lịch compact.</w:t>
               <w:br/>
-              <w:t>2. Click thẻ → highlight + sync ngày playback + mở popup.</w:t>
+              <w:t>2. Phạm vi 7 ngày gần nhất.</w:t>
               <w:br/>
-              <w:t>3. Popup: ảnh lớn, lịch sử xuất hiện, gallery mặt (nếu định danh).</w:t>
+              <w:t>3. «Đang xem ngày trước» khi không phải hôm nay.</w:t>
+            </w:r>
+          </w:p>
+        </w:tc>
+      </w:tr>
+      <w:tr>
+        <w:tc>
+          <w:tcPr>
+            <w:tcW w:type="dxa" w:w="4703"/>
+            <w:shd w:fill="EEF2F7" w:val="clear"/>
+          </w:tcPr>
+          <w:p>
+            <w:r>
+              <w:rPr>
+                <w:rFonts w:ascii="Calibri" w:hAnsi="Calibri" w:eastAsia="Calibri"/>
+                <w:b/>
+                <w:i w:val="0"/>
+                <w:sz w:val="20"/>
+              </w:rPr>
+              <w:t>Trạng thái</w:t>
+            </w:r>
+          </w:p>
+        </w:tc>
+        <w:tc>
+          <w:tcPr>
+            <w:tcW w:type="dxa" w:w="4703"/>
+            <w:shd w:fill="FFFFFF" w:val="clear"/>
+          </w:tcPr>
+          <w:p>
+            <w:r>
+              <w:rPr>
+                <w:rFonts w:ascii="Calibri" w:hAnsi="Calibri" w:eastAsia="Calibri"/>
+                <w:b/>
+                <w:i w:val="0"/>
+                <w:sz w:val="20"/>
+              </w:rPr>
+              <w:t>Sẵn sàng</w:t>
+            </w:r>
+          </w:p>
+        </w:tc>
+      </w:tr>
+    </w:tbl>
+    <w:p/>
+    <w:p>
+      <w:pPr>
+        <w:pStyle w:val="Heading3"/>
+      </w:pPr>
+      <w:r>
+        <w:t>EVT-02  Lọc tab 4 loại</w:t>
+      </w:r>
+    </w:p>
+    <w:tbl>
+      <w:tblPr>
+        <w:tblStyle w:val="TableGrid"/>
+        <w:tblW w:type="auto" w:w="0"/>
+        <w:tblLook w:firstColumn="1" w:firstRow="1" w:lastColumn="0" w:lastRow="0" w:noHBand="0" w:noVBand="1" w:val="04A0"/>
+      </w:tblPr>
+      <w:tblGrid>
+        <w:gridCol w:w="1814"/>
+        <w:gridCol w:w="7654"/>
+      </w:tblGrid>
+      <w:tr>
+        <w:tc>
+          <w:tcPr>
+            <w:tcW w:type="dxa" w:w="4703"/>
+            <w:shd w:fill="EEF2F7" w:val="clear"/>
+          </w:tcPr>
+          <w:p>
+            <w:r>
+              <w:rPr>
+                <w:rFonts w:ascii="Calibri" w:hAnsi="Calibri" w:eastAsia="Calibri"/>
+                <w:b/>
+                <w:i w:val="0"/>
+                <w:sz w:val="20"/>
+              </w:rPr>
+              <w:t>Vị trí</w:t>
+            </w:r>
+          </w:p>
+        </w:tc>
+        <w:tc>
+          <w:tcPr>
+            <w:tcW w:type="dxa" w:w="4703"/>
+          </w:tcPr>
+          <w:p>
+            <w:r>
+              <w:rPr>
+                <w:rFonts w:ascii="Calibri" w:hAnsi="Calibri" w:eastAsia="Calibri"/>
+                <w:b w:val="0"/>
+                <w:i w:val="0"/>
+                <w:sz w:val="20"/>
+              </w:rPr>
+              <w:t>Thanh tab dưới date picker</w:t>
+            </w:r>
+          </w:p>
+        </w:tc>
+      </w:tr>
+      <w:tr>
+        <w:tc>
+          <w:tcPr>
+            <w:tcW w:type="dxa" w:w="4703"/>
+            <w:shd w:fill="EEF2F7" w:val="clear"/>
+          </w:tcPr>
+          <w:p>
+            <w:r>
+              <w:rPr>
+                <w:rFonts w:ascii="Calibri" w:hAnsi="Calibri" w:eastAsia="Calibri"/>
+                <w:b/>
+                <w:i w:val="0"/>
+                <w:sz w:val="20"/>
+              </w:rPr>
+              <w:t>Mục đích</w:t>
+            </w:r>
+          </w:p>
+        </w:tc>
+        <w:tc>
+          <w:tcPr>
+            <w:tcW w:type="dxa" w:w="4703"/>
+          </w:tcPr>
+          <w:p>
+            <w:r>
+              <w:rPr>
+                <w:rFonts w:ascii="Calibri" w:hAnsi="Calibri" w:eastAsia="Calibri"/>
+                <w:b w:val="0"/>
+                <w:i w:val="0"/>
+                <w:sz w:val="20"/>
+              </w:rPr>
+              <w:t>Lọc theo mức nhận diện.</w:t>
+            </w:r>
+          </w:p>
+        </w:tc>
+      </w:tr>
+      <w:tr>
+        <w:tc>
+          <w:tcPr>
+            <w:tcW w:type="dxa" w:w="4703"/>
+            <w:shd w:fill="EEF2F7" w:val="clear"/>
+          </w:tcPr>
+          <w:p>
+            <w:r>
+              <w:rPr>
+                <w:rFonts w:ascii="Calibri" w:hAnsi="Calibri" w:eastAsia="Calibri"/>
+                <w:b/>
+                <w:i w:val="0"/>
+                <w:sz w:val="20"/>
+              </w:rPr>
+              <w:t>Cách sử dụng</w:t>
+            </w:r>
+          </w:p>
+        </w:tc>
+        <w:tc>
+          <w:tcPr>
+            <w:tcW w:type="dxa" w:w="4703"/>
+          </w:tcPr>
+          <w:p>
+            <w:r>
+              <w:rPr>
+                <w:rFonts w:ascii="Calibri" w:hAnsi="Calibri" w:eastAsia="Calibri"/>
+                <w:b w:val="0"/>
+                <w:i w:val="0"/>
+                <w:sz w:val="20"/>
+              </w:rPr>
+              <w:t>1. Tất cả — mọi thẻ có ảnh.</w:t>
               <w:br/>
-              <w:t>4. Escape hoặc nút X để đóng.</w:t>
+              <w:t>2. Đối tượng / Người / Định danh — theo tier.</w:t>
               <w:br/>
-              <w:t>5. Cuộn cuối danh sách → tải thêm thẻ tự động.</w:t>
+              <w:t>3. Badge = số thẻ trong tab.</w:t>
+            </w:r>
+          </w:p>
+        </w:tc>
+      </w:tr>
+      <w:tr>
+        <w:tc>
+          <w:tcPr>
+            <w:tcW w:type="dxa" w:w="4703"/>
+            <w:shd w:fill="EEF2F7" w:val="clear"/>
+          </w:tcPr>
+          <w:p>
+            <w:r>
+              <w:rPr>
+                <w:rFonts w:ascii="Calibri" w:hAnsi="Calibri" w:eastAsia="Calibri"/>
+                <w:b/>
+                <w:i w:val="0"/>
+                <w:sz w:val="20"/>
+              </w:rPr>
+              <w:t>Trạng thái</w:t>
+            </w:r>
+          </w:p>
+        </w:tc>
+        <w:tc>
+          <w:tcPr>
+            <w:tcW w:type="dxa" w:w="4703"/>
+            <w:shd w:fill="FFFFFF" w:val="clear"/>
+          </w:tcPr>
+          <w:p>
+            <w:r>
+              <w:rPr>
+                <w:rFonts w:ascii="Calibri" w:hAnsi="Calibri" w:eastAsia="Calibri"/>
+                <w:b/>
+                <w:i w:val="0"/>
+                <w:sz w:val="20"/>
+              </w:rPr>
+              <w:t>Sẵn sàng</w:t>
+            </w:r>
+          </w:p>
+        </w:tc>
+      </w:tr>
+    </w:tbl>
+    <w:p/>
+    <w:p>
+      <w:pPr>
+        <w:pStyle w:val="Heading3"/>
+      </w:pPr>
+      <w:r>
+        <w:t>EVT-03  Tìm kiếm</w:t>
+      </w:r>
+    </w:p>
+    <w:tbl>
+      <w:tblPr>
+        <w:tblStyle w:val="TableGrid"/>
+        <w:tblW w:type="auto" w:w="0"/>
+        <w:tblLook w:firstColumn="1" w:firstRow="1" w:lastColumn="0" w:lastRow="0" w:noHBand="0" w:noVBand="1" w:val="04A0"/>
+      </w:tblPr>
+      <w:tblGrid>
+        <w:gridCol w:w="1814"/>
+        <w:gridCol w:w="7654"/>
+      </w:tblGrid>
+      <w:tr>
+        <w:tc>
+          <w:tcPr>
+            <w:tcW w:type="dxa" w:w="4703"/>
+            <w:shd w:fill="EEF2F7" w:val="clear"/>
+          </w:tcPr>
+          <w:p>
+            <w:r>
+              <w:rPr>
+                <w:rFonts w:ascii="Calibri" w:hAnsi="Calibri" w:eastAsia="Calibri"/>
+                <w:b/>
+                <w:i w:val="0"/>
+                <w:sz w:val="20"/>
+              </w:rPr>
+              <w:t>Vị trí</w:t>
+            </w:r>
+          </w:p>
+        </w:tc>
+        <w:tc>
+          <w:tcPr>
+            <w:tcW w:type="dxa" w:w="4703"/>
+          </w:tcPr>
+          <w:p>
+            <w:r>
+              <w:rPr>
+                <w:rFonts w:ascii="Calibri" w:hAnsi="Calibri" w:eastAsia="Calibri"/>
+                <w:b w:val="0"/>
+                <w:i w:val="0"/>
+                <w:sz w:val="20"/>
+              </w:rPr>
+              <w:t>Ô tìm dưới tab</w:t>
+            </w:r>
+          </w:p>
+        </w:tc>
+      </w:tr>
+      <w:tr>
+        <w:tc>
+          <w:tcPr>
+            <w:tcW w:type="dxa" w:w="4703"/>
+            <w:shd w:fill="EEF2F7" w:val="clear"/>
+          </w:tcPr>
+          <w:p>
+            <w:r>
+              <w:rPr>
+                <w:rFonts w:ascii="Calibri" w:hAnsi="Calibri" w:eastAsia="Calibri"/>
+                <w:b/>
+                <w:i w:val="0"/>
+                <w:sz w:val="20"/>
+              </w:rPr>
+              <w:t>Mục đích</w:t>
+            </w:r>
+          </w:p>
+        </w:tc>
+        <w:tc>
+          <w:tcPr>
+            <w:tcW w:type="dxa" w:w="4703"/>
+          </w:tcPr>
+          <w:p>
+            <w:r>
+              <w:rPr>
+                <w:rFonts w:ascii="Calibri" w:hAnsi="Calibri" w:eastAsia="Calibri"/>
+                <w:b w:val="0"/>
+                <w:i w:val="0"/>
+                <w:sz w:val="20"/>
+              </w:rPr>
+              <w:t>Tìm người trong danh sách.</w:t>
+            </w:r>
+          </w:p>
+        </w:tc>
+      </w:tr>
+      <w:tr>
+        <w:tc>
+          <w:tcPr>
+            <w:tcW w:type="dxa" w:w="4703"/>
+            <w:shd w:fill="EEF2F7" w:val="clear"/>
+          </w:tcPr>
+          <w:p>
+            <w:r>
+              <w:rPr>
+                <w:rFonts w:ascii="Calibri" w:hAnsi="Calibri" w:eastAsia="Calibri"/>
+                <w:b/>
+                <w:i w:val="0"/>
+                <w:sz w:val="20"/>
+              </w:rPr>
+              <w:t>Cách sử dụng</w:t>
+            </w:r>
+          </w:p>
+        </w:tc>
+        <w:tc>
+          <w:tcPr>
+            <w:tcW w:type="dxa" w:w="4703"/>
+          </w:tcPr>
+          <w:p>
+            <w:r>
+              <w:rPr>
+                <w:rFonts w:ascii="Calibri" w:hAnsi="Calibri" w:eastAsia="Calibri"/>
+                <w:b w:val="0"/>
+                <w:i w:val="0"/>
+                <w:sz w:val="20"/>
+              </w:rPr>
+              <w:t>1. Gõ tên, mã NV, hoặc pers_id.</w:t>
+              <w:br/>
+              <w:t>2. Lọc sau ~0,3 giây khi ngừng gõ.</w:t>
+            </w:r>
+          </w:p>
+        </w:tc>
+      </w:tr>
+      <w:tr>
+        <w:tc>
+          <w:tcPr>
+            <w:tcW w:type="dxa" w:w="4703"/>
+            <w:shd w:fill="EEF2F7" w:val="clear"/>
+          </w:tcPr>
+          <w:p>
+            <w:r>
+              <w:rPr>
+                <w:rFonts w:ascii="Calibri" w:hAnsi="Calibri" w:eastAsia="Calibri"/>
+                <w:b/>
+                <w:i w:val="0"/>
+                <w:sz w:val="20"/>
+              </w:rPr>
+              <w:t>Trạng thái</w:t>
+            </w:r>
+          </w:p>
+        </w:tc>
+        <w:tc>
+          <w:tcPr>
+            <w:tcW w:type="dxa" w:w="4703"/>
+            <w:shd w:fill="FFFFFF" w:val="clear"/>
+          </w:tcPr>
+          <w:p>
+            <w:r>
+              <w:rPr>
+                <w:rFonts w:ascii="Calibri" w:hAnsi="Calibri" w:eastAsia="Calibri"/>
+                <w:b/>
+                <w:i w:val="0"/>
+                <w:sz w:val="20"/>
+              </w:rPr>
+              <w:t>Sẵn sàng</w:t>
+            </w:r>
+          </w:p>
+        </w:tc>
+      </w:tr>
+    </w:tbl>
+    <w:p/>
+    <w:p>
+      <w:pPr>
+        <w:pStyle w:val="Heading3"/>
+      </w:pPr>
+      <w:r>
+        <w:t>EVT-04  Thẻ sự kiện</w:t>
+      </w:r>
+    </w:p>
+    <w:tbl>
+      <w:tblPr>
+        <w:tblStyle w:val="TableGrid"/>
+        <w:tblW w:type="auto" w:w="0"/>
+        <w:tblLook w:firstColumn="1" w:firstRow="1" w:lastColumn="0" w:lastRow="0" w:noHBand="0" w:noVBand="1" w:val="04A0"/>
+      </w:tblPr>
+      <w:tblGrid>
+        <w:gridCol w:w="1814"/>
+        <w:gridCol w:w="7654"/>
+      </w:tblGrid>
+      <w:tr>
+        <w:tc>
+          <w:tcPr>
+            <w:tcW w:type="dxa" w:w="4703"/>
+            <w:shd w:fill="EEF2F7" w:val="clear"/>
+          </w:tcPr>
+          <w:p>
+            <w:r>
+              <w:rPr>
+                <w:rFonts w:ascii="Calibri" w:hAnsi="Calibri" w:eastAsia="Calibri"/>
+                <w:b/>
+                <w:i w:val="0"/>
+                <w:sz w:val="20"/>
+              </w:rPr>
+              <w:t>Vị trí</w:t>
+            </w:r>
+          </w:p>
+        </w:tc>
+        <w:tc>
+          <w:tcPr>
+            <w:tcW w:type="dxa" w:w="4703"/>
+          </w:tcPr>
+          <w:p>
+            <w:r>
+              <w:rPr>
+                <w:rFonts w:ascii="Calibri" w:hAnsi="Calibri" w:eastAsia="Calibri"/>
+                <w:b w:val="0"/>
+                <w:i w:val="0"/>
+                <w:sz w:val="20"/>
+              </w:rPr>
+              <w:t>Danh sách cuộn panel Sự kiện</w:t>
+            </w:r>
+          </w:p>
+        </w:tc>
+      </w:tr>
+      <w:tr>
+        <w:tc>
+          <w:tcPr>
+            <w:tcW w:type="dxa" w:w="4703"/>
+            <w:shd w:fill="EEF2F7" w:val="clear"/>
+          </w:tcPr>
+          <w:p>
+            <w:r>
+              <w:rPr>
+                <w:rFonts w:ascii="Calibri" w:hAnsi="Calibri" w:eastAsia="Calibri"/>
+                <w:b/>
+                <w:i w:val="0"/>
+                <w:sz w:val="20"/>
+              </w:rPr>
+              <w:t>Mục đích</w:t>
+            </w:r>
+          </w:p>
+        </w:tc>
+        <w:tc>
+          <w:tcPr>
+            <w:tcW w:type="dxa" w:w="4703"/>
+          </w:tcPr>
+          <w:p>
+            <w:r>
+              <w:rPr>
+                <w:rFonts w:ascii="Calibri" w:hAnsi="Calibri" w:eastAsia="Calibri"/>
+                <w:b w:val="0"/>
+                <w:i w:val="0"/>
+                <w:sz w:val="20"/>
+              </w:rPr>
+              <w:t>Xem snapshot, thời gian, mũ ghi nhận (Helmet 01–10).</w:t>
+            </w:r>
+          </w:p>
+        </w:tc>
+      </w:tr>
+      <w:tr>
+        <w:tc>
+          <w:tcPr>
+            <w:tcW w:type="dxa" w:w="4703"/>
+            <w:shd w:fill="EEF2F7" w:val="clear"/>
+          </w:tcPr>
+          <w:p>
+            <w:r>
+              <w:rPr>
+                <w:rFonts w:ascii="Calibri" w:hAnsi="Calibri" w:eastAsia="Calibri"/>
+                <w:b/>
+                <w:i w:val="0"/>
+                <w:sz w:val="20"/>
+              </w:rPr>
+              <w:t>Cách sử dụng</w:t>
+            </w:r>
+          </w:p>
+        </w:tc>
+        <w:tc>
+          <w:tcPr>
+            <w:tcW w:type="dxa" w:w="4703"/>
+          </w:tcPr>
+          <w:p>
+            <w:r>
+              <w:rPr>
+                <w:rFonts w:ascii="Calibri" w:hAnsi="Calibri" w:eastAsia="Calibri"/>
+                <w:b w:val="0"/>
+                <w:i w:val="0"/>
+                <w:sz w:val="20"/>
+              </w:rPr>
+              <w:t>1. Mỗi thẻ: badge tier, thumbnail, tên/alias, giờ, vị trí/mũ.</w:t>
+              <w:br/>
+              <w:t>2. Click thẻ → highlight + sync ngày playback.</w:t>
+              <w:br/>
+              <w:t>3. Cuộn cuối danh sách → tải thêm tự động.</w:t>
+            </w:r>
+          </w:p>
+        </w:tc>
+      </w:tr>
+      <w:tr>
+        <w:tc>
+          <w:tcPr>
+            <w:tcW w:type="dxa" w:w="4703"/>
+            <w:shd w:fill="EEF2F7" w:val="clear"/>
+          </w:tcPr>
+          <w:p>
+            <w:r>
+              <w:rPr>
+                <w:rFonts w:ascii="Calibri" w:hAnsi="Calibri" w:eastAsia="Calibri"/>
+                <w:b/>
+                <w:i w:val="0"/>
+                <w:sz w:val="20"/>
+              </w:rPr>
+              <w:t>Lưu ý</w:t>
+            </w:r>
+          </w:p>
+        </w:tc>
+        <w:tc>
+          <w:tcPr>
+            <w:tcW w:type="dxa" w:w="4703"/>
+          </w:tcPr>
+          <w:p>
+            <w:r>
+              <w:rPr>
+                <w:rFonts w:ascii="Calibri" w:hAnsi="Calibri" w:eastAsia="Calibri"/>
+                <w:b w:val="0"/>
+                <w:i w:val="0"/>
+                <w:sz w:val="20"/>
+              </w:rPr>
+              <w:t>Chỉ hiện thẻ có snapshotUrl.</w:t>
+            </w:r>
+          </w:p>
+        </w:tc>
+      </w:tr>
+      <w:tr>
+        <w:tc>
+          <w:tcPr>
+            <w:tcW w:type="dxa" w:w="4703"/>
+            <w:shd w:fill="EEF2F7" w:val="clear"/>
+          </w:tcPr>
+          <w:p>
+            <w:r>
+              <w:rPr>
+                <w:rFonts w:ascii="Calibri" w:hAnsi="Calibri" w:eastAsia="Calibri"/>
+                <w:b/>
+                <w:i w:val="0"/>
+                <w:sz w:val="20"/>
+              </w:rPr>
+              <w:t>Trạng thái</w:t>
+            </w:r>
+          </w:p>
+        </w:tc>
+        <w:tc>
+          <w:tcPr>
+            <w:tcW w:type="dxa" w:w="4703"/>
+            <w:shd w:fill="FFFFFF" w:val="clear"/>
+          </w:tcPr>
+          <w:p>
+            <w:r>
+              <w:rPr>
+                <w:rFonts w:ascii="Calibri" w:hAnsi="Calibri" w:eastAsia="Calibri"/>
+                <w:b/>
+                <w:i w:val="0"/>
+                <w:sz w:val="20"/>
+              </w:rPr>
+              <w:t>Sẵn sàng</w:t>
+            </w:r>
+          </w:p>
+        </w:tc>
+      </w:tr>
+    </w:tbl>
+    <w:p/>
+    <w:p>
+      <w:pPr>
+        <w:pStyle w:val="Heading3"/>
+      </w:pPr>
+      <w:r>
+        <w:t>EVT-05  Popup chi tiết</w:t>
+      </w:r>
+    </w:p>
+    <w:tbl>
+      <w:tblPr>
+        <w:tblStyle w:val="TableGrid"/>
+        <w:tblW w:type="auto" w:w="0"/>
+        <w:tblLook w:firstColumn="1" w:firstRow="1" w:lastColumn="0" w:lastRow="0" w:noHBand="0" w:noVBand="1" w:val="04A0"/>
+      </w:tblPr>
+      <w:tblGrid>
+        <w:gridCol w:w="1814"/>
+        <w:gridCol w:w="7654"/>
+      </w:tblGrid>
+      <w:tr>
+        <w:tc>
+          <w:tcPr>
+            <w:tcW w:type="dxa" w:w="4703"/>
+            <w:shd w:fill="EEF2F7" w:val="clear"/>
+          </w:tcPr>
+          <w:p>
+            <w:r>
+              <w:rPr>
+                <w:rFonts w:ascii="Calibri" w:hAnsi="Calibri" w:eastAsia="Calibri"/>
+                <w:b/>
+                <w:i w:val="0"/>
+                <w:sz w:val="20"/>
+              </w:rPr>
+              <w:t>Vị trí</w:t>
+            </w:r>
+          </w:p>
+        </w:tc>
+        <w:tc>
+          <w:tcPr>
+            <w:tcW w:type="dxa" w:w="4703"/>
+          </w:tcPr>
+          <w:p>
+            <w:r>
+              <w:rPr>
+                <w:rFonts w:ascii="Calibri" w:hAnsi="Calibri" w:eastAsia="Calibri"/>
+                <w:b w:val="0"/>
+                <w:i w:val="0"/>
+                <w:sz w:val="20"/>
+              </w:rPr>
+              <w:t>Overlay sau khi click thẻ</w:t>
+            </w:r>
+          </w:p>
+        </w:tc>
+      </w:tr>
+      <w:tr>
+        <w:tc>
+          <w:tcPr>
+            <w:tcW w:type="dxa" w:w="4703"/>
+            <w:shd w:fill="EEF2F7" w:val="clear"/>
+          </w:tcPr>
+          <w:p>
+            <w:r>
+              <w:rPr>
+                <w:rFonts w:ascii="Calibri" w:hAnsi="Calibri" w:eastAsia="Calibri"/>
+                <w:b/>
+                <w:i w:val="0"/>
+                <w:sz w:val="20"/>
+              </w:rPr>
+              <w:t>Mục đích</w:t>
+            </w:r>
+          </w:p>
+        </w:tc>
+        <w:tc>
+          <w:tcPr>
+            <w:tcW w:type="dxa" w:w="4703"/>
+          </w:tcPr>
+          <w:p>
+            <w:r>
+              <w:rPr>
+                <w:rFonts w:ascii="Calibri" w:hAnsi="Calibri" w:eastAsia="Calibri"/>
+                <w:b w:val="0"/>
+                <w:i w:val="0"/>
+                <w:sz w:val="20"/>
+              </w:rPr>
+              <w:t>Xem ảnh lớn, lịch sử xuất hiện, gallery mặt.</w:t>
+            </w:r>
+          </w:p>
+        </w:tc>
+      </w:tr>
+      <w:tr>
+        <w:tc>
+          <w:tcPr>
+            <w:tcW w:type="dxa" w:w="4703"/>
+            <w:shd w:fill="EEF2F7" w:val="clear"/>
+          </w:tcPr>
+          <w:p>
+            <w:r>
+              <w:rPr>
+                <w:rFonts w:ascii="Calibri" w:hAnsi="Calibri" w:eastAsia="Calibri"/>
+                <w:b/>
+                <w:i w:val="0"/>
+                <w:sz w:val="20"/>
+              </w:rPr>
+              <w:t>Cách sử dụng</w:t>
+            </w:r>
+          </w:p>
+        </w:tc>
+        <w:tc>
+          <w:tcPr>
+            <w:tcW w:type="dxa" w:w="4703"/>
+          </w:tcPr>
+          <w:p>
+            <w:r>
+              <w:rPr>
+                <w:rFonts w:ascii="Calibri" w:hAnsi="Calibri" w:eastAsia="Calibri"/>
+                <w:b w:val="0"/>
+                <w:i w:val="0"/>
+                <w:sz w:val="20"/>
+              </w:rPr>
+              <w:t>1. Popup: tier, tên, camera/mũ, GPS, thời gian.</w:t>
+              <w:br/>
+              <w:t>2. Lịch sử xuất hiện trong ngày (nhiều mũ / nhiều lần).</w:t>
+              <w:br/>
+              <w:t>3. Escape hoặc X để đóng.</w:t>
             </w:r>
           </w:p>
         </w:tc>
@@ -5297,7 +6625,7 @@
         <w:pStyle w:val="Heading2"/>
       </w:pPr>
       <w:r>
-        <w:t>3.1  Giám sát ca tuần tra (realtime)</w:t>
+        <w:t>3.1  Giám sát ca tuần tra</w:t>
       </w:r>
     </w:p>
     <w:p>
@@ -5311,7 +6639,7 @@
           <w:i w:val="0"/>
           <w:sz w:val="22"/>
         </w:rPr>
-        <w:t>Mở /module05 — kiểm tra KPI Khu vực và Nhân sự.</w:t>
+        <w:t>Mở /module05 — kiểm tra KPI Tổng quan (Khu vực, Nhân sự).</w:t>
       </w:r>
     </w:p>
     <w:p>
@@ -5325,7 +6653,7 @@
           <w:i w:val="0"/>
           <w:sz w:val="22"/>
         </w:rPr>
-        <w:t>Camera Live — xem Helmet 02 (hoặc chọn mũ khác).</w:t>
+        <w:t>Camera Live — chọn mũ cần theo dõi trong lưới 10 helmet.</w:t>
       </w:r>
     </w:p>
     <w:p>
@@ -5353,7 +6681,7 @@
           <w:i w:val="0"/>
           <w:sz w:val="22"/>
         </w:rPr>
-        <w:t>Heatmap — theo dõi chấm và lộ trình mũ.</w:t>
+        <w:t>Heatmap — theo dõi chấm và lộ trình các mũ online.</w:t>
       </w:r>
     </w:p>
     <w:p>
@@ -5367,7 +6695,7 @@
           <w:i w:val="0"/>
           <w:sz w:val="22"/>
         </w:rPr>
-        <w:t>Sự kiện tab «Tất cả» — xem phát hiện mới (tự refresh hôm nay).</w:t>
+        <w:t>Sự kiện tab «Tất cả» — xem phát hiện mới.</w:t>
       </w:r>
     </w:p>
     <w:p>
@@ -5375,7 +6703,7 @@
         <w:pStyle w:val="Heading2"/>
       </w:pPr>
       <w:r>
-        <w:t>3.2  Tra cứu sự cố / đối chiếu bằng chứng</w:t>
+        <w:t>3.2  Tra cứu sự cố</w:t>
       </w:r>
     </w:p>
     <w:p>
@@ -5389,7 +6717,7 @@
           <w:i w:val="0"/>
           <w:sz w:val="22"/>
         </w:rPr>
-        <w:t>Sự kiện — chọn ngày xảy ra.</w:t>
+        <w:t>Sự kiện — chọn ngày.</w:t>
       </w:r>
     </w:p>
     <w:p>
@@ -5403,7 +6731,7 @@
           <w:i w:val="0"/>
           <w:sz w:val="22"/>
         </w:rPr>
-        <w:t>Tìm theo tên/mã hoặc lọc tab Đối tượng / Định danh.</w:t>
+        <w:t>Tìm theo tên/mã hoặc lọc tab.</w:t>
       </w:r>
     </w:p>
     <w:p>
@@ -5417,7 +6745,7 @@
           <w:i w:val="0"/>
           <w:sz w:val="22"/>
         </w:rPr>
-        <w:t>Click thẻ → popup chi tiết + lịch sử xuất hiện.</w:t>
+        <w:t>Click thẻ → popup chi tiết (xem mũ nào ghi nhận).</w:t>
       </w:r>
     </w:p>
     <w:p>
@@ -5431,7 +6759,7 @@
           <w:i w:val="0"/>
           <w:sz w:val="22"/>
         </w:rPr>
-        <w:t>Camera Playback — xem clip 30 giây cùng thời điểm.</w:t>
+        <w:t>Camera Playback — xem clip 30 giây cùng mũ &amp; thời điểm.</w:t>
       </w:r>
     </w:p>
     <w:p>
@@ -5439,7 +6767,7 @@
         <w:pStyle w:val="Heading2"/>
       </w:pPr>
       <w:r>
-        <w:t>3.3  Gán danh tính cho người chưa rõ</w:t>
+        <w:t>3.3  Gán danh tính</w:t>
       </w:r>
     </w:p>
     <w:p>
@@ -5453,7 +6781,7 @@
           <w:i w:val="0"/>
           <w:sz w:val="22"/>
         </w:rPr>
-        <w:t>Sự kiện tab «Đối tượng» — hoặc click chấm xám trên Heatmap.</w:t>
+        <w:t>Sự kiện tab «Đối tượng» hoặc chấm xám trên Heatmap.</w:t>
       </w:r>
     </w:p>
     <w:p>
@@ -5481,7 +6809,7 @@
           <w:i w:val="0"/>
           <w:sz w:val="22"/>
         </w:rPr>
-        <w:t>Heatmap sheet → nhập mã NV trong panel gán.</w:t>
+        <w:t>Heatmap sheet → nhập mã NV.</w:t>
       </w:r>
     </w:p>
     <w:p>
@@ -5514,6 +6842,7 @@
                 <w:rFonts w:ascii="Calibri" w:hAnsi="Calibri" w:eastAsia="Calibri"/>
                 <w:b/>
                 <w:i w:val="0"/>
+                <w:color w:val="FFFFFF"/>
                 <w:sz w:val="20"/>
               </w:rPr>
               <w:t>Câu hỏi</w:t>
@@ -5531,6 +6860,7 @@
                 <w:rFonts w:ascii="Calibri" w:hAnsi="Calibri" w:eastAsia="Calibri"/>
                 <w:b/>
                 <w:i w:val="0"/>
+                <w:color w:val="FFFFFF"/>
                 <w:sz w:val="20"/>
               </w:rPr>
               <w:t>Trả lời</w:t>
@@ -5551,7 +6881,7 @@
                 <w:i w:val="0"/>
                 <w:sz w:val="20"/>
               </w:rPr>
-              <w:t>Nhân sự khác badge tab Sự kiện?</w:t>
+              <w:t>Có bao nhiêu mũ?</w:t>
             </w:r>
           </w:p>
         </w:tc>
@@ -5567,7 +6897,7 @@
                 <w:i w:val="0"/>
                 <w:sz w:val="20"/>
               </w:rPr>
-              <w:t>KPI từ sổ cái ngày; tab đếm thẻ có ảnh — hai cách đếm khác nhau, bình thường.</w:t>
+              <w:t>10 mũ — Helmet 01 đến Helmet 10, mỗi mũ một luồng RTSP.</w:t>
             </w:r>
           </w:p>
         </w:tc>
@@ -5585,7 +6915,7 @@
                 <w:i w:val="0"/>
                 <w:sz w:val="20"/>
               </w:rPr>
-              <w:t>Lượt gặm nhiều hơn số người?</w:t>
+              <w:t>Nhân sự khác badge tab?</w:t>
             </w:r>
           </w:p>
         </w:tc>
@@ -5601,7 +6931,7 @@
                 <w:i w:val="0"/>
                 <w:sz w:val="20"/>
               </w:rPr>
-              <w:t>Mỗi lần vào khung = 1 lượt. Không dùng để suy ra số người lạ.</w:t>
+              <w:t>KPI từ sổ cái ngày; tab đếm thẻ có ảnh — bình thường.</w:t>
             </w:r>
           </w:p>
         </w:tc>
@@ -5619,7 +6949,7 @@
                 <w:i w:val="0"/>
                 <w:sz w:val="20"/>
               </w:rPr>
-              <w:t>Không thấy thẻ sự kiện?</w:t>
+              <w:t>Lượt gặm &gt; số người?</w:t>
             </w:r>
           </w:p>
         </w:tc>
@@ -5635,7 +6965,7 @@
                 <w:i w:val="0"/>
                 <w:sz w:val="20"/>
               </w:rPr>
-              <w:t>Chỉ hiện khi có snapshot. Thử ngày khác hoặc chờ backend ghi nhận.</w:t>
+              <w:t>Mỗi lần vào khung bất kỳ mũ nào = 1 lượt.</w:t>
             </w:r>
           </w:p>
         </w:tc>
@@ -5653,7 +6983,7 @@
                 <w:i w:val="0"/>
                 <w:sz w:val="20"/>
               </w:rPr>
-              <w:t>Chấm map và video không khớp ngay?</w:t>
+              <w:t>Một người nhiều mũ ghi nhận?</w:t>
             </w:r>
           </w:p>
         </w:tc>
@@ -5669,7 +6999,7 @@
                 <w:i w:val="0"/>
                 <w:sz w:val="20"/>
               </w:rPr>
-              <w:t>Map cập nhật sau vài giây. ROI video delay ~5s — bình thường.</w:t>
+              <w:t>Có thể — mỗi mũ ghi riêng; dedupe theo entity trên map/tab.</w:t>
             </w:r>
           </w:p>
         </w:tc>
@@ -5687,7 +7017,7 @@
                 <w:i w:val="0"/>
                 <w:sz w:val="20"/>
               </w:rPr>
-              <w:t>Xem được bao nhiêu ngày?</w:t>
+              <w:t>Không thấy thẻ?</w:t>
             </w:r>
           </w:p>
         </w:tc>
@@ -5703,7 +7033,41 @@
                 <w:i w:val="0"/>
                 <w:sz w:val="20"/>
               </w:rPr>
-              <w:t>7 ngày gần nhất — playback, sự kiện, heatmap dùng chung ngày.</w:t>
+              <w:t>Chỉ hiện khi có snapshot. Thử ngày khác.</w:t>
+            </w:r>
+          </w:p>
+        </w:tc>
+      </w:tr>
+      <w:tr>
+        <w:tc>
+          <w:tcPr>
+            <w:tcW w:type="dxa" w:w="3402"/>
+          </w:tcPr>
+          <w:p>
+            <w:r>
+              <w:rPr>
+                <w:rFonts w:ascii="Calibri" w:hAnsi="Calibri" w:eastAsia="Calibri"/>
+                <w:b w:val="0"/>
+                <w:i w:val="0"/>
+                <w:sz w:val="20"/>
+              </w:rPr>
+              <w:t>Xem bao nhiêu ngày?</w:t>
+            </w:r>
+          </w:p>
+        </w:tc>
+        <w:tc>
+          <w:tcPr>
+            <w:tcW w:type="dxa" w:w="5953"/>
+          </w:tcPr>
+          <w:p>
+            <w:r>
+              <w:rPr>
+                <w:rFonts w:ascii="Calibri" w:hAnsi="Calibri" w:eastAsia="Calibri"/>
+                <w:b w:val="0"/>
+                <w:i w:val="0"/>
+                <w:sz w:val="20"/>
+              </w:rPr>
+              <w:t>7 ngày — playback, sự kiện, heatmap dùng chung ngày.</w:t>
             </w:r>
           </w:p>
         </w:tc>
@@ -5724,22 +7088,11 @@
       </w:r>
     </w:p>
     <w:p>
-      <w:r>
-        <w:rPr>
-          <w:rFonts w:ascii="Calibri" w:hAnsi="Calibri" w:eastAsia="Calibri"/>
-          <w:b/>
-          <w:i w:val="0"/>
-          <w:sz w:val="22"/>
-        </w:rPr>
-        <w:t>Các mục dưới đây chưa có hướng dẫn vận hành chính thức. Không dùng làm căn cứ đào tạo cho đến khi tài liệu được cập nhật.</w:t>
-      </w:r>
-    </w:p>
-    <w:p>
       <w:pPr>
         <w:pStyle w:val="Heading2"/>
       </w:pPr>
       <w:r>
-        <w:t>5.1  Flycam &amp; Flymap — Cập nhật sau</w:t>
+        <w:t>5.1  Flycam / Flymap — Cập nhật sau</w:t>
       </w:r>
     </w:p>
     <w:tbl>
@@ -5765,6 +7118,7 @@
                 <w:rFonts w:ascii="Calibri" w:hAnsi="Calibri" w:eastAsia="Calibri"/>
                 <w:b/>
                 <w:i w:val="0"/>
+                <w:color w:val="FFFFFF"/>
                 <w:sz w:val="20"/>
               </w:rPr>
               <w:t>Mã</w:t>
@@ -5782,6 +7136,7 @@
                 <w:rFonts w:ascii="Calibri" w:hAnsi="Calibri" w:eastAsia="Calibri"/>
                 <w:b/>
                 <w:i w:val="0"/>
+                <w:color w:val="FFFFFF"/>
                 <w:sz w:val="20"/>
               </w:rPr>
               <w:t>Hạng mục</w:t>
@@ -5799,6 +7154,7 @@
                 <w:rFonts w:ascii="Calibri" w:hAnsi="Calibri" w:eastAsia="Calibri"/>
                 <w:b/>
                 <w:i w:val="0"/>
+                <w:color w:val="FFFFFF"/>
                 <w:sz w:val="20"/>
               </w:rPr>
               <w:t>Trạng thái</w:t>
@@ -5819,7 +7175,7 @@
                 <w:i w:val="0"/>
                 <w:sz w:val="20"/>
               </w:rPr>
-              <w:t>F-05</w:t>
+              <w:t>TQ-04</w:t>
             </w:r>
           </w:p>
         </w:tc>
@@ -5835,7 +7191,7 @@
                 <w:i w:val="0"/>
                 <w:sz w:val="20"/>
               </w:rPr>
-              <w:t>KPI Mật độ flymap (Tổng Quan)</w:t>
+              <w:t>KPI Mật độ flymap</w:t>
             </w:r>
           </w:p>
         </w:tc>
@@ -5869,7 +7225,7 @@
                 <w:i w:val="0"/>
                 <w:sz w:val="20"/>
               </w:rPr>
-              <w:t>F-13</w:t>
+              <w:t>CAM-06</w:t>
             </w:r>
           </w:p>
         </w:tc>
@@ -5885,7 +7241,7 @@
                 <w:i w:val="0"/>
                 <w:sz w:val="20"/>
               </w:rPr>
-              <w:t>Chế độ Flymap (panel map)</w:t>
+              <w:t>Flycam trên Camera</w:t>
             </w:r>
           </w:p>
         </w:tc>
@@ -5919,7 +7275,7 @@
                 <w:i w:val="0"/>
                 <w:sz w:val="20"/>
               </w:rPr>
-              <w:t>F-14</w:t>
+              <w:t>MAP-06</w:t>
             </w:r>
           </w:p>
         </w:tc>
@@ -5935,7 +7291,7 @@
                 <w:i w:val="0"/>
                 <w:sz w:val="20"/>
               </w:rPr>
-              <w:t>Tab Flycam &amp; tile Drone 03 (Camera Live)</w:t>
+              <w:t>Chế độ Flymap</w:t>
             </w:r>
           </w:p>
         </w:tc>
@@ -5958,17 +7314,6 @@
       </w:tr>
     </w:tbl>
     <w:p/>
-    <w:p>
-      <w:r>
-        <w:rPr>
-          <w:rFonts w:ascii="Calibri" w:hAnsi="Calibri" w:eastAsia="Calibri"/>
-          <w:b w:val="0"/>
-          <w:i/>
-          <w:sz w:val="22"/>
-        </w:rPr>
-        <w:t>Nội dung dự kiến bổ sung: cách bật Flymap, đọc overlay mật độ, phân biệt tầm cao/tầm thấp, quy tắc lọc sự kiện flycam.</w:t>
-      </w:r>
-    </w:p>
     <w:p>
       <w:pPr>
         <w:pStyle w:val="Heading2"/>
@@ -6000,6 +7345,7 @@
                 <w:rFonts w:ascii="Calibri" w:hAnsi="Calibri" w:eastAsia="Calibri"/>
                 <w:b/>
                 <w:i w:val="0"/>
+                <w:color w:val="FFFFFF"/>
                 <w:sz w:val="20"/>
               </w:rPr>
               <w:t>Đường dẫn</w:t>
@@ -6017,6 +7363,7 @@
                 <w:rFonts w:ascii="Calibri" w:hAnsi="Calibri" w:eastAsia="Calibri"/>
                 <w:b/>
                 <w:i w:val="0"/>
+                <w:color w:val="FFFFFF"/>
                 <w:sz w:val="20"/>
               </w:rPr>
               <w:t>Mô tả</w:t>
@@ -6034,6 +7381,7 @@
                 <w:rFonts w:ascii="Calibri" w:hAnsi="Calibri" w:eastAsia="Calibri"/>
                 <w:b/>
                 <w:i w:val="0"/>
+                <w:color w:val="FFFFFF"/>
                 <w:sz w:val="20"/>
               </w:rPr>
               <w:t>Trạng thái</w:t>
@@ -6192,18 +7540,6 @@
         </w:tc>
       </w:tr>
     </w:tbl>
-    <w:p/>
-    <w:p>
-      <w:r>
-        <w:rPr>
-          <w:rFonts w:ascii="Calibri" w:hAnsi="Calibri" w:eastAsia="Calibri"/>
-          <w:b w:val="0"/>
-          <w:i/>
-          <w:sz w:val="22"/>
-        </w:rPr>
-        <w:t>Hướng dẫn các trang trên sẽ phát hành riêng — chưa nằm trong phạm vi tài liệu này.</w:t>
-      </w:r>
-    </w:p>
     <w:p/>
     <w:p>
       <w:pPr>

</xml_diff>